<commit_message>
Night worker fields in form
</commit_message>
<xml_diff>
--- a/src/assets/applicationForms/Night-Worker-Health-Assessment.docx
+++ b/src/assets/applicationForms/Night-Worker-Health-Assessment.docx
@@ -73,7 +73,7 @@
       <w:tblPr>
         <w:tblW w:w="9864" w:type="dxa"/>
         <w:jc w:val="start"/>
-        <w:tblInd w:w="-270" w:type="dxa"/>
+        <w:tblInd w:w="-157" w:type="dxa"/>
         <w:tblLayout w:type="fixed"/>
         <w:tblCellMar>
           <w:top w:w="0" w:type="dxa"/>
@@ -84,15 +84,15 @@
         <w:tblLook w:noHBand="0" w:lastColumn="1" w:firstColumn="1" w:lastRow="1" w:firstRow="1" w:noVBand="0" w:val="01e0"/>
       </w:tblPr>
       <w:tblGrid>
-        <w:gridCol w:w="8715"/>
-        <w:gridCol w:w="609"/>
+        <w:gridCol w:w="8714"/>
+        <w:gridCol w:w="610"/>
         <w:gridCol w:w="540"/>
       </w:tblGrid>
       <w:tr>
         <w:trPr/>
         <w:tc>
           <w:tcPr>
-            <w:tcW w:w="8715" w:type="dxa"/>
+            <w:tcW w:w="8714" w:type="dxa"/>
             <w:tcBorders>
               <w:top w:val="single" w:sz="4" w:space="0" w:color="000000"/>
               <w:start w:val="single" w:sz="4" w:space="0" w:color="000000"/>
@@ -121,7 +121,7 @@
         </w:tc>
         <w:tc>
           <w:tcPr>
-            <w:tcW w:w="609" w:type="dxa"/>
+            <w:tcW w:w="610" w:type="dxa"/>
             <w:tcBorders>
               <w:top w:val="single" w:sz="4" w:space="0" w:color="000000"/>
               <w:start w:val="single" w:sz="4" w:space="0" w:color="000000"/>
@@ -180,7 +180,7 @@
         <w:trPr/>
         <w:tc>
           <w:tcPr>
-            <w:tcW w:w="8715" w:type="dxa"/>
+            <w:tcW w:w="8714" w:type="dxa"/>
             <w:tcBorders>
               <w:top w:val="single" w:sz="4" w:space="0" w:color="000000"/>
               <w:start w:val="single" w:sz="4" w:space="0" w:color="000000"/>
@@ -202,74 +202,59 @@
               </w:rPr>
               <w:t>a)</w:t>
               <w:tab/>
-              <w:t>Diabetes?</w:t>
-            </w:r>
-          </w:p>
-        </w:tc>
-        <w:tc>
-          <w:tcPr>
-            <w:tcW w:w="609" w:type="dxa"/>
-            <w:tcBorders>
-              <w:top w:val="single" w:sz="4" w:space="0" w:color="000000"/>
-              <w:start w:val="single" w:sz="4" w:space="0" w:color="000000"/>
-              <w:bottom w:val="single" w:sz="4" w:space="0" w:color="000000"/>
-              <w:end w:val="single" w:sz="4" w:space="0" w:color="000000"/>
-            </w:tcBorders>
-          </w:tcPr>
-          <w:p>
-            <w:pPr>
-              <w:pStyle w:val="Normal"/>
-              <w:spacing w:before="0" w:after="160"/>
-              <w:rPr>
-                <w:b/>
-                <w:lang w:val="en-GB"/>
-              </w:rPr>
-            </w:pPr>
-            <w:r>
-              <w:fldChar w:fldCharType="begin">
-                <w:ffData>
-                  <w:name w:val="Check1"/>
-                  <w:enabled/>
-                  <w:calcOnExit w:val="0"/>
-                  <w:checkBox>
-                    <w:sizeAuto/>
-                  </w:checkBox>
-                </w:ffData>
-              </w:fldChar>
-            </w:r>
-            <w:r>
-              <w:rPr>
-                <w:b/>
-                <w:lang w:val="en-GB"/>
-              </w:rPr>
-              <w:instrText xml:space="preserve"> FORMCHECKBOX </w:instrText>
-            </w:r>
-            <w:r>
-              <w:rPr>
-                <w:b/>
-                <w:lang w:val="en-GB"/>
-              </w:rPr>
-              <w:fldChar w:fldCharType="separate"/>
-            </w:r>
-            <w:bookmarkStart w:id="0" w:name="Check1_Copy_1"/>
-            <w:bookmarkStart w:id="1" w:name="Check1"/>
-            <w:bookmarkStart w:id="2" w:name="Check1"/>
-            <w:bookmarkEnd w:id="2"/>
-            <w:r/>
-            <w:r>
-              <w:rPr>
-                <w:b/>
-                <w:lang w:val="en-GB"/>
-              </w:rPr>
-              <w:fldChar w:fldCharType="end"/>
-            </w:r>
-            <w:r>
-              <w:rPr>
-                <w:b/>
-                <w:lang w:val="en-GB"/>
-              </w:rPr>
-            </w:r>
-            <w:bookmarkEnd w:id="0"/>
+              <w:t xml:space="preserve">Diabetes? </w:t>
+            </w:r>
+          </w:p>
+        </w:tc>
+        <w:tc>
+          <w:tcPr>
+            <w:tcW w:w="610" w:type="dxa"/>
+            <w:tcBorders>
+              <w:top w:val="single" w:sz="4" w:space="0" w:color="000000"/>
+              <w:start w:val="single" w:sz="4" w:space="0" w:color="000000"/>
+              <w:bottom w:val="single" w:sz="4" w:space="0" w:color="000000"/>
+              <w:end w:val="single" w:sz="4" w:space="0" w:color="000000"/>
+            </w:tcBorders>
+          </w:tcPr>
+          <w:p>
+            <w:pPr>
+              <w:pStyle w:val="Normal"/>
+              <w:spacing w:before="0" w:after="160"/>
+              <w:rPr>
+                <w:lang w:val="en-GB"/>
+              </w:rPr>
+            </w:pPr>
+            <w:r>
+              <w:rPr>
+                <w:b/>
+                <w:color w:val="000000"/>
+                <w:sz w:val="22"/>
+                <w:u w:val="none"/>
+                <w:lang w:val="en-GB"/>
+              </w:rPr>
+              <w:t>{#health_diabetes == 'YES'}</w:t>
+            </w:r>
+            <w:r>
+              <w:rPr>
+                <w:rFonts w:ascii="AppleSymbols" w:hAnsi="AppleSymbols"/>
+                <w:b/>
+                <w:color w:val="000000"/>
+                <w:sz w:val="22"/>
+                <w:u w:val="none"/>
+                <w:lang w:val="en-GB"/>
+              </w:rPr>
+              <w:t>✓</w:t>
+            </w:r>
+            <w:r>
+              <w:rPr>
+                <w:b/>
+                <w:color w:val="000000"/>
+                <w:sz w:val="22"/>
+                <w:u w:val="none"/>
+                <w:lang w:val="en-GB"/>
+              </w:rPr>
+              <w:t>{/}</w:t>
+            </w:r>
           </w:p>
         </w:tc>
         <w:tc>
@@ -287,56 +272,59 @@
               <w:pStyle w:val="Normal"/>
               <w:spacing w:before="0" w:after="160"/>
               <w:rPr>
-                <w:b/>
-                <w:lang w:val="en-GB"/>
-              </w:rPr>
-            </w:pPr>
-            <w:r>
-              <w:rPr/>
-              <w:drawing>
-                <wp:inline distT="0" distB="0" distL="0" distR="0">
-                  <wp:extent cx="123825" cy="208915"/>
-                  <wp:effectExtent l="0" t="0" r="0" b="0"/>
-                  <wp:docPr id="1" name="Graphic 1" descr="Checkmark with solid fill"/>
-                  <wp:cNvGraphicFramePr>
-                    <a:graphicFrameLocks xmlns:a="http://schemas.openxmlformats.org/drawingml/2006/main" noChangeAspect="1"/>
-                  </wp:cNvGraphicFramePr>
-                  <a:graphic xmlns:a="http://schemas.openxmlformats.org/drawingml/2006/main">
-                    <a:graphicData uri="http://schemas.openxmlformats.org/drawingml/2006/picture">
-                      <pic:pic xmlns:pic="http://schemas.openxmlformats.org/drawingml/2006/picture">
-                        <pic:nvPicPr>
-                          <pic:cNvPr id="1" name="Graphic 1" descr="Checkmark with solid fill"/>
-                          <pic:cNvPicPr>
-                            <a:picLocks noChangeAspect="1" noChangeArrowheads="1"/>
-                          </pic:cNvPicPr>
-                        </pic:nvPicPr>
-                        <pic:blipFill>
-                          <a:blip r:embed="rId2">
-                            <a:extLst>
-                              <a:ext uri="{96DAC541-7B7A-43D3-8B79-37D633B846F1}">
-                                <asvg:svgBlip xmlns:asvg="http://schemas.microsoft.com/office/drawing/2016/SVG/main" r:embed="rId3"/>
-                              </a:ext>
-                            </a:extLst>
-                          </a:blip>
-                          <a:stretch>
-                            <a:fillRect/>
-                          </a:stretch>
-                        </pic:blipFill>
-                        <pic:spPr bwMode="auto">
-                          <a:xfrm>
-                            <a:off x="0" y="0"/>
-                            <a:ext cx="123825" cy="208915"/>
-                          </a:xfrm>
-                          <a:prstGeom prst="rect">
-                            <a:avLst/>
-                          </a:prstGeom>
-                          <a:noFill/>
-                        </pic:spPr>
-                      </pic:pic>
-                    </a:graphicData>
-                  </a:graphic>
-                </wp:inline>
-              </w:drawing>
+                <w:lang w:val="en-GB"/>
+              </w:rPr>
+            </w:pPr>
+            <w:r>
+              <w:rPr>
+                <w:b/>
+                <w:color w:val="000000"/>
+                <w:sz w:val="22"/>
+                <w:u w:val="none"/>
+                <w:lang w:val="en-GB"/>
+              </w:rPr>
+              <w:t>{#health_diabetes == '</w:t>
+            </w:r>
+            <w:r>
+              <w:rPr>
+                <w:b/>
+                <w:color w:val="000000"/>
+                <w:sz w:val="22"/>
+                <w:u w:val="none"/>
+                <w:lang w:val="en-GB"/>
+              </w:rPr>
+              <w:t>NO</w:t>
+            </w:r>
+            <w:r>
+              <w:rPr>
+                <w:b/>
+                <w:color w:val="000000"/>
+                <w:sz w:val="22"/>
+                <w:u w:val="none"/>
+                <w:lang w:val="en-GB"/>
+              </w:rPr>
+              <w:t>'}</w:t>
+            </w:r>
+            <w:r>
+              <w:rPr>
+                <w:rFonts w:ascii="AppleSymbols" w:hAnsi="AppleSymbols"/>
+                <w:b/>
+                <w:color w:val="000000"/>
+                <w:sz w:val="22"/>
+                <w:u w:val="none"/>
+                <w:lang w:val="en-GB"/>
+              </w:rPr>
+              <w:t>✓</w:t>
+            </w:r>
+            <w:r>
+              <w:rPr>
+                <w:b/>
+                <w:color w:val="000000"/>
+                <w:sz w:val="22"/>
+                <w:u w:val="none"/>
+                <w:lang w:val="en-GB"/>
+              </w:rPr>
+              <w:t>{/}</w:t>
             </w:r>
           </w:p>
         </w:tc>
@@ -347,7 +335,7 @@
         </w:trPr>
         <w:tc>
           <w:tcPr>
-            <w:tcW w:w="8715" w:type="dxa"/>
+            <w:tcW w:w="8714" w:type="dxa"/>
             <w:tcBorders>
               <w:top w:val="single" w:sz="4" w:space="0" w:color="000000"/>
               <w:start w:val="single" w:sz="4" w:space="0" w:color="000000"/>
@@ -381,68 +369,53 @@
         </w:tc>
         <w:tc>
           <w:tcPr>
-            <w:tcW w:w="609" w:type="dxa"/>
-            <w:tcBorders>
-              <w:top w:val="single" w:sz="4" w:space="0" w:color="000000"/>
-              <w:start w:val="single" w:sz="4" w:space="0" w:color="000000"/>
-              <w:bottom w:val="single" w:sz="4" w:space="0" w:color="000000"/>
-              <w:end w:val="single" w:sz="4" w:space="0" w:color="000000"/>
-            </w:tcBorders>
-          </w:tcPr>
-          <w:p>
-            <w:pPr>
-              <w:pStyle w:val="Normal"/>
-              <w:spacing w:before="0" w:after="160"/>
-              <w:rPr>
-                <w:b/>
-                <w:lang w:val="en-GB"/>
-              </w:rPr>
-            </w:pPr>
-            <w:r>
-              <w:fldChar w:fldCharType="begin">
-                <w:ffData>
-                  <w:name w:val="Check3"/>
-                  <w:enabled/>
-                  <w:calcOnExit w:val="0"/>
-                  <w:checkBox>
-                    <w:sizeAuto/>
-                  </w:checkBox>
-                </w:ffData>
-              </w:fldChar>
-            </w:r>
-            <w:r>
-              <w:rPr>
-                <w:b/>
-                <w:lang w:val="en-GB"/>
-              </w:rPr>
-              <w:instrText xml:space="preserve"> FORMCHECKBOX </w:instrText>
-            </w:r>
-            <w:r>
-              <w:rPr>
-                <w:b/>
-                <w:lang w:val="en-GB"/>
-              </w:rPr>
-              <w:fldChar w:fldCharType="separate"/>
-            </w:r>
-            <w:bookmarkStart w:id="3" w:name="Check3_Copy_1"/>
-            <w:bookmarkStart w:id="4" w:name="Check3"/>
-            <w:bookmarkStart w:id="5" w:name="Check3"/>
-            <w:bookmarkEnd w:id="5"/>
-            <w:r/>
-            <w:r>
-              <w:rPr>
-                <w:b/>
-                <w:lang w:val="en-GB"/>
-              </w:rPr>
-              <w:fldChar w:fldCharType="end"/>
-            </w:r>
-            <w:r>
-              <w:rPr>
-                <w:b/>
-                <w:lang w:val="en-GB"/>
-              </w:rPr>
-            </w:r>
-            <w:bookmarkEnd w:id="3"/>
+            <w:tcW w:w="610" w:type="dxa"/>
+            <w:tcBorders>
+              <w:top w:val="single" w:sz="4" w:space="0" w:color="000000"/>
+              <w:start w:val="single" w:sz="4" w:space="0" w:color="000000"/>
+              <w:bottom w:val="single" w:sz="4" w:space="0" w:color="000000"/>
+              <w:end w:val="single" w:sz="4" w:space="0" w:color="000000"/>
+            </w:tcBorders>
+          </w:tcPr>
+          <w:p>
+            <w:pPr>
+              <w:pStyle w:val="Normal"/>
+              <w:spacing w:before="0" w:after="160"/>
+              <w:rPr>
+                <w:lang w:val="en-GB"/>
+              </w:rPr>
+            </w:pPr>
+            <w:r>
+              <w:rPr>
+                <w:b/>
+                <w:color w:val="000000"/>
+                <w:sz w:val="22"/>
+                <w:u w:val="none"/>
+                <w:lang w:val="en-GB"/>
+              </w:rPr>
+              <w:t>{#health_heartCirculatory == 'YES'}</w:t>
+            </w:r>
+            <w:r>
+              <w:rPr>
+                <w:rFonts w:ascii="AppleSymbols" w:hAnsi="AppleSymbols"/>
+                <w:b/>
+                <w:color w:val="000000"/>
+                <w:sz w:val="22"/>
+                <w:u w:val="none"/>
+                <w:lang w:val="en-GB"/>
+              </w:rPr>
+              <w:t>✓</w:t>
+            </w:r>
+            <w:r>
+              <w:rPr>
+                <w:b/>
+                <w:color w:val="000000"/>
+                <w:sz w:val="22"/>
+                <w:u w:val="none"/>
+                <w:lang w:val="en-GB"/>
+              </w:rPr>
+              <w:t>{/}</w:t>
+            </w:r>
           </w:p>
         </w:tc>
         <w:tc>
@@ -460,56 +433,59 @@
               <w:pStyle w:val="Normal"/>
               <w:spacing w:before="0" w:after="160"/>
               <w:rPr>
-                <w:b/>
-                <w:lang w:val="en-GB"/>
-              </w:rPr>
-            </w:pPr>
-            <w:r>
-              <w:rPr/>
-              <w:drawing>
-                <wp:inline distT="0" distB="0" distL="0" distR="0">
-                  <wp:extent cx="123825" cy="208915"/>
-                  <wp:effectExtent l="0" t="0" r="0" b="0"/>
-                  <wp:docPr id="2" name="Image2" descr="Checkmark with solid fill"/>
-                  <wp:cNvGraphicFramePr>
-                    <a:graphicFrameLocks xmlns:a="http://schemas.openxmlformats.org/drawingml/2006/main" noChangeAspect="1"/>
-                  </wp:cNvGraphicFramePr>
-                  <a:graphic xmlns:a="http://schemas.openxmlformats.org/drawingml/2006/main">
-                    <a:graphicData uri="http://schemas.openxmlformats.org/drawingml/2006/picture">
-                      <pic:pic xmlns:pic="http://schemas.openxmlformats.org/drawingml/2006/picture">
-                        <pic:nvPicPr>
-                          <pic:cNvPr id="2" name="Image2" descr="Checkmark with solid fill"/>
-                          <pic:cNvPicPr>
-                            <a:picLocks noChangeAspect="1" noChangeArrowheads="1"/>
-                          </pic:cNvPicPr>
-                        </pic:nvPicPr>
-                        <pic:blipFill>
-                          <a:blip r:embed="rId4">
-                            <a:extLst>
-                              <a:ext uri="{96DAC541-7B7A-43D3-8B79-37D633B846F1}">
-                                <asvg:svgBlip xmlns:asvg="http://schemas.microsoft.com/office/drawing/2016/SVG/main" r:embed="rId5"/>
-                              </a:ext>
-                            </a:extLst>
-                          </a:blip>
-                          <a:stretch>
-                            <a:fillRect/>
-                          </a:stretch>
-                        </pic:blipFill>
-                        <pic:spPr bwMode="auto">
-                          <a:xfrm>
-                            <a:off x="0" y="0"/>
-                            <a:ext cx="123825" cy="208915"/>
-                          </a:xfrm>
-                          <a:prstGeom prst="rect">
-                            <a:avLst/>
-                          </a:prstGeom>
-                          <a:noFill/>
-                        </pic:spPr>
-                      </pic:pic>
-                    </a:graphicData>
-                  </a:graphic>
-                </wp:inline>
-              </w:drawing>
+                <w:lang w:val="en-GB"/>
+              </w:rPr>
+            </w:pPr>
+            <w:r>
+              <w:rPr>
+                <w:b/>
+                <w:color w:val="000000"/>
+                <w:sz w:val="22"/>
+                <w:u w:val="none"/>
+                <w:lang w:val="en-GB"/>
+              </w:rPr>
+              <w:t>{#health_heartCirculatory == '</w:t>
+            </w:r>
+            <w:r>
+              <w:rPr>
+                <w:b/>
+                <w:color w:val="000000"/>
+                <w:sz w:val="22"/>
+                <w:u w:val="none"/>
+                <w:lang w:val="en-GB"/>
+              </w:rPr>
+              <w:t>NO</w:t>
+            </w:r>
+            <w:r>
+              <w:rPr>
+                <w:b/>
+                <w:color w:val="000000"/>
+                <w:sz w:val="22"/>
+                <w:u w:val="none"/>
+                <w:lang w:val="en-GB"/>
+              </w:rPr>
+              <w:t>'}</w:t>
+            </w:r>
+            <w:r>
+              <w:rPr>
+                <w:rFonts w:ascii="AppleSymbols" w:hAnsi="AppleSymbols"/>
+                <w:b/>
+                <w:color w:val="000000"/>
+                <w:sz w:val="22"/>
+                <w:u w:val="none"/>
+                <w:lang w:val="en-GB"/>
+              </w:rPr>
+              <w:t>✓</w:t>
+            </w:r>
+            <w:r>
+              <w:rPr>
+                <w:b/>
+                <w:color w:val="000000"/>
+                <w:sz w:val="22"/>
+                <w:u w:val="none"/>
+                <w:lang w:val="en-GB"/>
+              </w:rPr>
+              <w:t>{/}</w:t>
             </w:r>
           </w:p>
         </w:tc>
@@ -520,7 +496,7 @@
         </w:trPr>
         <w:tc>
           <w:tcPr>
-            <w:tcW w:w="8715" w:type="dxa"/>
+            <w:tcW w:w="8714" w:type="dxa"/>
             <w:tcBorders>
               <w:top w:val="single" w:sz="4" w:space="0" w:color="000000"/>
               <w:start w:val="single" w:sz="4" w:space="0" w:color="000000"/>
@@ -546,65 +522,52 @@
         </w:tc>
         <w:tc>
           <w:tcPr>
-            <w:tcW w:w="609" w:type="dxa"/>
-            <w:tcBorders>
-              <w:top w:val="single" w:sz="4" w:space="0" w:color="000000"/>
-              <w:start w:val="single" w:sz="4" w:space="0" w:color="000000"/>
-              <w:bottom w:val="single" w:sz="4" w:space="0" w:color="000000"/>
-              <w:end w:val="single" w:sz="4" w:space="0" w:color="000000"/>
-            </w:tcBorders>
-          </w:tcPr>
-          <w:p>
-            <w:pPr>
-              <w:pStyle w:val="Normal"/>
-              <w:spacing w:before="0" w:after="160"/>
-              <w:rPr>
-                <w:b/>
-                <w:lang w:val="en-GB"/>
-              </w:rPr>
-            </w:pPr>
-            <w:r>
-              <w:fldChar w:fldCharType="begin">
-                <w:ffData>
-                  <w:name w:val="Check3 Copy 2"/>
-                  <w:enabled/>
-                  <w:calcOnExit w:val="0"/>
-                  <w:checkBox>
-                    <w:sizeAuto/>
-                  </w:checkBox>
-                </w:ffData>
-              </w:fldChar>
-            </w:r>
-            <w:r>
-              <w:rPr>
-                <w:b/>
-                <w:lang w:val="en-GB"/>
-              </w:rPr>
-              <w:instrText xml:space="preserve"> FORMCHECKBOX </w:instrText>
-            </w:r>
-            <w:r>
-              <w:rPr>
-                <w:b/>
-                <w:lang w:val="en-GB"/>
-              </w:rPr>
-              <w:fldChar w:fldCharType="separate"/>
-            </w:r>
-            <w:bookmarkStart w:id="6" w:name="Check3_Copy_2"/>
-            <w:bookmarkStart w:id="7" w:name="Check3_Copy_2"/>
-            <w:bookmarkEnd w:id="7"/>
-            <w:r/>
-            <w:r>
-              <w:rPr>
-                <w:b/>
-                <w:lang w:val="en-GB"/>
-              </w:rPr>
-              <w:fldChar w:fldCharType="end"/>
-            </w:r>
-            <w:r>
-              <w:rPr>
-                <w:b/>
-                <w:lang w:val="en-GB"/>
-              </w:rPr>
+            <w:tcW w:w="610" w:type="dxa"/>
+            <w:tcBorders>
+              <w:top w:val="single" w:sz="4" w:space="0" w:color="000000"/>
+              <w:start w:val="single" w:sz="4" w:space="0" w:color="000000"/>
+              <w:bottom w:val="single" w:sz="4" w:space="0" w:color="000000"/>
+              <w:end w:val="single" w:sz="4" w:space="0" w:color="000000"/>
+            </w:tcBorders>
+          </w:tcPr>
+          <w:p>
+            <w:pPr>
+              <w:pStyle w:val="Normal"/>
+              <w:spacing w:before="0" w:after="160"/>
+              <w:rPr>
+                <w:lang w:val="en-GB"/>
+              </w:rPr>
+            </w:pPr>
+            <w:r>
+              <w:rPr>
+                <w:b/>
+                <w:color w:val="000000"/>
+                <w:sz w:val="22"/>
+                <w:u w:val="none"/>
+                <w:lang w:val="en-GB"/>
+              </w:rPr>
+              <w:t>{#health_stomachIntestinal == 'YES'}</w:t>
+            </w:r>
+            <w:r>
+              <w:rPr>
+                <w:rFonts w:ascii="AppleSymbols" w:hAnsi="AppleSymbols"/>
+                <w:b/>
+                <w:color w:val="000000"/>
+                <w:sz w:val="22"/>
+                <w:u w:val="none"/>
+                <w:lang w:val="en-GB"/>
+              </w:rPr>
+              <w:t>✓</w:t>
+            </w:r>
+            <w:r>
+              <w:rPr>
+                <w:b/>
+                <w:color w:val="000000"/>
+                <w:sz w:val="22"/>
+                <w:u w:val="none"/>
+                <w:lang w:val="en-GB"/>
+              </w:rPr>
+              <w:t>{/}</w:t>
             </w:r>
           </w:p>
         </w:tc>
@@ -623,56 +586,59 @@
               <w:pStyle w:val="Normal"/>
               <w:spacing w:before="0" w:after="160"/>
               <w:rPr>
-                <w:b/>
-                <w:lang w:val="en-GB"/>
-              </w:rPr>
-            </w:pPr>
-            <w:r>
-              <w:rPr/>
-              <w:drawing>
-                <wp:inline distT="0" distB="0" distL="0" distR="0">
-                  <wp:extent cx="123825" cy="208915"/>
-                  <wp:effectExtent l="0" t="0" r="0" b="0"/>
-                  <wp:docPr id="3" name="Image3" descr="Checkmark with solid fill"/>
-                  <wp:cNvGraphicFramePr>
-                    <a:graphicFrameLocks xmlns:a="http://schemas.openxmlformats.org/drawingml/2006/main" noChangeAspect="1"/>
-                  </wp:cNvGraphicFramePr>
-                  <a:graphic xmlns:a="http://schemas.openxmlformats.org/drawingml/2006/main">
-                    <a:graphicData uri="http://schemas.openxmlformats.org/drawingml/2006/picture">
-                      <pic:pic xmlns:pic="http://schemas.openxmlformats.org/drawingml/2006/picture">
-                        <pic:nvPicPr>
-                          <pic:cNvPr id="3" name="Image3" descr="Checkmark with solid fill"/>
-                          <pic:cNvPicPr>
-                            <a:picLocks noChangeAspect="1" noChangeArrowheads="1"/>
-                          </pic:cNvPicPr>
-                        </pic:nvPicPr>
-                        <pic:blipFill>
-                          <a:blip r:embed="rId6">
-                            <a:extLst>
-                              <a:ext uri="{96DAC541-7B7A-43D3-8B79-37D633B846F1}">
-                                <asvg:svgBlip xmlns:asvg="http://schemas.microsoft.com/office/drawing/2016/SVG/main" r:embed="rId7"/>
-                              </a:ext>
-                            </a:extLst>
-                          </a:blip>
-                          <a:stretch>
-                            <a:fillRect/>
-                          </a:stretch>
-                        </pic:blipFill>
-                        <pic:spPr bwMode="auto">
-                          <a:xfrm>
-                            <a:off x="0" y="0"/>
-                            <a:ext cx="123825" cy="208915"/>
-                          </a:xfrm>
-                          <a:prstGeom prst="rect">
-                            <a:avLst/>
-                          </a:prstGeom>
-                          <a:noFill/>
-                        </pic:spPr>
-                      </pic:pic>
-                    </a:graphicData>
-                  </a:graphic>
-                </wp:inline>
-              </w:drawing>
+                <w:lang w:val="en-GB"/>
+              </w:rPr>
+            </w:pPr>
+            <w:r>
+              <w:rPr>
+                <w:b/>
+                <w:color w:val="000000"/>
+                <w:sz w:val="22"/>
+                <w:u w:val="none"/>
+                <w:lang w:val="en-GB"/>
+              </w:rPr>
+              <w:t>{#health_stomachIntestinal == '</w:t>
+            </w:r>
+            <w:r>
+              <w:rPr>
+                <w:b/>
+                <w:color w:val="000000"/>
+                <w:sz w:val="22"/>
+                <w:u w:val="none"/>
+                <w:lang w:val="en-GB"/>
+              </w:rPr>
+              <w:t>NO</w:t>
+            </w:r>
+            <w:r>
+              <w:rPr>
+                <w:b/>
+                <w:color w:val="000000"/>
+                <w:sz w:val="22"/>
+                <w:u w:val="none"/>
+                <w:lang w:val="en-GB"/>
+              </w:rPr>
+              <w:t>'}</w:t>
+            </w:r>
+            <w:r>
+              <w:rPr>
+                <w:rFonts w:ascii="AppleSymbols" w:hAnsi="AppleSymbols"/>
+                <w:b/>
+                <w:color w:val="000000"/>
+                <w:sz w:val="22"/>
+                <w:u w:val="none"/>
+                <w:lang w:val="en-GB"/>
+              </w:rPr>
+              <w:t>✓</w:t>
+            </w:r>
+            <w:r>
+              <w:rPr>
+                <w:b/>
+                <w:color w:val="000000"/>
+                <w:sz w:val="22"/>
+                <w:u w:val="none"/>
+                <w:lang w:val="en-GB"/>
+              </w:rPr>
+              <w:t>{/}</w:t>
             </w:r>
           </w:p>
         </w:tc>
@@ -681,7 +647,7 @@
         <w:trPr/>
         <w:tc>
           <w:tcPr>
-            <w:tcW w:w="8715" w:type="dxa"/>
+            <w:tcW w:w="8714" w:type="dxa"/>
             <w:tcBorders>
               <w:top w:val="single" w:sz="4" w:space="0" w:color="000000"/>
               <w:start w:val="single" w:sz="4" w:space="0" w:color="000000"/>
@@ -709,68 +675,53 @@
         </w:tc>
         <w:tc>
           <w:tcPr>
-            <w:tcW w:w="609" w:type="dxa"/>
-            <w:tcBorders>
-              <w:top w:val="single" w:sz="4" w:space="0" w:color="000000"/>
-              <w:start w:val="single" w:sz="4" w:space="0" w:color="000000"/>
-              <w:bottom w:val="single" w:sz="4" w:space="0" w:color="000000"/>
-              <w:end w:val="single" w:sz="4" w:space="0" w:color="000000"/>
-            </w:tcBorders>
-          </w:tcPr>
-          <w:p>
-            <w:pPr>
-              <w:pStyle w:val="Normal"/>
-              <w:spacing w:before="0" w:after="160"/>
-              <w:rPr>
-                <w:b/>
-                <w:lang w:val="en-GB"/>
-              </w:rPr>
-            </w:pPr>
-            <w:r>
-              <w:fldChar w:fldCharType="begin">
-                <w:ffData>
-                  <w:name w:val="Check5"/>
-                  <w:enabled/>
-                  <w:calcOnExit w:val="0"/>
-                  <w:checkBox>
-                    <w:sizeAuto/>
-                  </w:checkBox>
-                </w:ffData>
-              </w:fldChar>
-            </w:r>
-            <w:r>
-              <w:rPr>
-                <w:b/>
-                <w:lang w:val="en-GB"/>
-              </w:rPr>
-              <w:instrText xml:space="preserve"> FORMCHECKBOX </w:instrText>
-            </w:r>
-            <w:r>
-              <w:rPr>
-                <w:b/>
-                <w:lang w:val="en-GB"/>
-              </w:rPr>
-              <w:fldChar w:fldCharType="separate"/>
-            </w:r>
-            <w:bookmarkStart w:id="8" w:name="Check5_Copy_1"/>
-            <w:bookmarkStart w:id="9" w:name="Check5"/>
-            <w:bookmarkStart w:id="10" w:name="Check5"/>
-            <w:bookmarkEnd w:id="10"/>
-            <w:r/>
-            <w:r>
-              <w:rPr>
-                <w:b/>
-                <w:lang w:val="en-GB"/>
-              </w:rPr>
-              <w:fldChar w:fldCharType="end"/>
-            </w:r>
-            <w:r>
-              <w:rPr>
-                <w:b/>
-                <w:lang w:val="en-GB"/>
-              </w:rPr>
-            </w:r>
-            <w:bookmarkEnd w:id="8"/>
+            <w:tcW w:w="610" w:type="dxa"/>
+            <w:tcBorders>
+              <w:top w:val="single" w:sz="4" w:space="0" w:color="000000"/>
+              <w:start w:val="single" w:sz="4" w:space="0" w:color="000000"/>
+              <w:bottom w:val="single" w:sz="4" w:space="0" w:color="000000"/>
+              <w:end w:val="single" w:sz="4" w:space="0" w:color="000000"/>
+            </w:tcBorders>
+          </w:tcPr>
+          <w:p>
+            <w:pPr>
+              <w:pStyle w:val="Normal"/>
+              <w:spacing w:before="0" w:after="160"/>
+              <w:rPr>
+                <w:lang w:val="en-GB"/>
+              </w:rPr>
+            </w:pPr>
+            <w:r>
+              <w:rPr>
+                <w:b/>
+                <w:color w:val="000000"/>
+                <w:sz w:val="22"/>
+                <w:u w:val="none"/>
+                <w:lang w:val="en-GB"/>
+              </w:rPr>
+              <w:t>{#health_difficultySleeping == 'YES'}</w:t>
+            </w:r>
+            <w:r>
+              <w:rPr>
+                <w:rFonts w:ascii="AppleSymbols" w:hAnsi="AppleSymbols"/>
+                <w:b/>
+                <w:color w:val="000000"/>
+                <w:sz w:val="22"/>
+                <w:u w:val="none"/>
+                <w:lang w:val="en-GB"/>
+              </w:rPr>
+              <w:t>✓</w:t>
+            </w:r>
+            <w:r>
+              <w:rPr>
+                <w:b/>
+                <w:color w:val="000000"/>
+                <w:sz w:val="22"/>
+                <w:u w:val="none"/>
+                <w:lang w:val="en-GB"/>
+              </w:rPr>
+              <w:t>{/}</w:t>
+            </w:r>
           </w:p>
         </w:tc>
         <w:tc>
@@ -788,56 +739,59 @@
               <w:pStyle w:val="Normal"/>
               <w:spacing w:before="0" w:after="160"/>
               <w:rPr>
-                <w:b/>
-                <w:lang w:val="en-GB"/>
-              </w:rPr>
-            </w:pPr>
-            <w:r>
-              <w:rPr/>
-              <w:drawing>
-                <wp:inline distT="0" distB="0" distL="0" distR="0">
-                  <wp:extent cx="123825" cy="208915"/>
-                  <wp:effectExtent l="0" t="0" r="0" b="0"/>
-                  <wp:docPr id="4" name="Image4" descr="Checkmark with solid fill"/>
-                  <wp:cNvGraphicFramePr>
-                    <a:graphicFrameLocks xmlns:a="http://schemas.openxmlformats.org/drawingml/2006/main" noChangeAspect="1"/>
-                  </wp:cNvGraphicFramePr>
-                  <a:graphic xmlns:a="http://schemas.openxmlformats.org/drawingml/2006/main">
-                    <a:graphicData uri="http://schemas.openxmlformats.org/drawingml/2006/picture">
-                      <pic:pic xmlns:pic="http://schemas.openxmlformats.org/drawingml/2006/picture">
-                        <pic:nvPicPr>
-                          <pic:cNvPr id="4" name="Image4" descr="Checkmark with solid fill"/>
-                          <pic:cNvPicPr>
-                            <a:picLocks noChangeAspect="1" noChangeArrowheads="1"/>
-                          </pic:cNvPicPr>
-                        </pic:nvPicPr>
-                        <pic:blipFill>
-                          <a:blip r:embed="rId8">
-                            <a:extLst>
-                              <a:ext uri="{96DAC541-7B7A-43D3-8B79-37D633B846F1}">
-                                <asvg:svgBlip xmlns:asvg="http://schemas.microsoft.com/office/drawing/2016/SVG/main" r:embed="rId9"/>
-                              </a:ext>
-                            </a:extLst>
-                          </a:blip>
-                          <a:stretch>
-                            <a:fillRect/>
-                          </a:stretch>
-                        </pic:blipFill>
-                        <pic:spPr bwMode="auto">
-                          <a:xfrm>
-                            <a:off x="0" y="0"/>
-                            <a:ext cx="123825" cy="208915"/>
-                          </a:xfrm>
-                          <a:prstGeom prst="rect">
-                            <a:avLst/>
-                          </a:prstGeom>
-                          <a:noFill/>
-                        </pic:spPr>
-                      </pic:pic>
-                    </a:graphicData>
-                  </a:graphic>
-                </wp:inline>
-              </w:drawing>
+                <w:lang w:val="en-GB"/>
+              </w:rPr>
+            </w:pPr>
+            <w:r>
+              <w:rPr>
+                <w:b/>
+                <w:color w:val="000000"/>
+                <w:sz w:val="22"/>
+                <w:u w:val="none"/>
+                <w:lang w:val="en-GB"/>
+              </w:rPr>
+              <w:t>{#health_difficultySleeping == '</w:t>
+            </w:r>
+            <w:r>
+              <w:rPr>
+                <w:b/>
+                <w:color w:val="000000"/>
+                <w:sz w:val="22"/>
+                <w:u w:val="none"/>
+                <w:lang w:val="en-GB"/>
+              </w:rPr>
+              <w:t>NO</w:t>
+            </w:r>
+            <w:r>
+              <w:rPr>
+                <w:b/>
+                <w:color w:val="000000"/>
+                <w:sz w:val="22"/>
+                <w:u w:val="none"/>
+                <w:lang w:val="en-GB"/>
+              </w:rPr>
+              <w:t>'}</w:t>
+            </w:r>
+            <w:r>
+              <w:rPr>
+                <w:rFonts w:ascii="AppleSymbols" w:hAnsi="AppleSymbols"/>
+                <w:b/>
+                <w:color w:val="000000"/>
+                <w:sz w:val="22"/>
+                <w:u w:val="none"/>
+                <w:lang w:val="en-GB"/>
+              </w:rPr>
+              <w:t>✓</w:t>
+            </w:r>
+            <w:r>
+              <w:rPr>
+                <w:b/>
+                <w:color w:val="000000"/>
+                <w:sz w:val="22"/>
+                <w:u w:val="none"/>
+                <w:lang w:val="en-GB"/>
+              </w:rPr>
+              <w:t>{/}</w:t>
             </w:r>
           </w:p>
         </w:tc>
@@ -846,7 +800,7 @@
         <w:trPr/>
         <w:tc>
           <w:tcPr>
-            <w:tcW w:w="8715" w:type="dxa"/>
+            <w:tcW w:w="8714" w:type="dxa"/>
             <w:tcBorders>
               <w:top w:val="single" w:sz="4" w:space="0" w:color="000000"/>
               <w:start w:val="single" w:sz="4" w:space="0" w:color="000000"/>
@@ -872,68 +826,53 @@
         </w:tc>
         <w:tc>
           <w:tcPr>
-            <w:tcW w:w="609" w:type="dxa"/>
-            <w:tcBorders>
-              <w:top w:val="single" w:sz="4" w:space="0" w:color="000000"/>
-              <w:start w:val="single" w:sz="4" w:space="0" w:color="000000"/>
-              <w:bottom w:val="single" w:sz="4" w:space="0" w:color="000000"/>
-              <w:end w:val="single" w:sz="4" w:space="0" w:color="000000"/>
-            </w:tcBorders>
-          </w:tcPr>
-          <w:p>
-            <w:pPr>
-              <w:pStyle w:val="Normal"/>
-              <w:spacing w:before="0" w:after="160"/>
-              <w:rPr>
-                <w:b/>
-                <w:lang w:val="en-GB"/>
-              </w:rPr>
-            </w:pPr>
-            <w:r>
-              <w:fldChar w:fldCharType="begin">
-                <w:ffData>
-                  <w:name w:val="Check7"/>
-                  <w:enabled/>
-                  <w:calcOnExit w:val="0"/>
-                  <w:checkBox>
-                    <w:sizeAuto/>
-                  </w:checkBox>
-                </w:ffData>
-              </w:fldChar>
-            </w:r>
-            <w:r>
-              <w:rPr>
-                <w:b/>
-                <w:lang w:val="en-GB"/>
-              </w:rPr>
-              <w:instrText xml:space="preserve"> FORMCHECKBOX </w:instrText>
-            </w:r>
-            <w:r>
-              <w:rPr>
-                <w:b/>
-                <w:lang w:val="en-GB"/>
-              </w:rPr>
-              <w:fldChar w:fldCharType="separate"/>
-            </w:r>
-            <w:bookmarkStart w:id="11" w:name="Check7_Copy_1"/>
-            <w:bookmarkStart w:id="12" w:name="Check7"/>
-            <w:bookmarkStart w:id="13" w:name="Check7"/>
-            <w:bookmarkEnd w:id="13"/>
-            <w:r/>
-            <w:r>
-              <w:rPr>
-                <w:b/>
-                <w:lang w:val="en-GB"/>
-              </w:rPr>
-              <w:fldChar w:fldCharType="end"/>
-            </w:r>
-            <w:r>
-              <w:rPr>
-                <w:b/>
-                <w:lang w:val="en-GB"/>
-              </w:rPr>
-            </w:r>
-            <w:bookmarkEnd w:id="11"/>
+            <w:tcW w:w="610" w:type="dxa"/>
+            <w:tcBorders>
+              <w:top w:val="single" w:sz="4" w:space="0" w:color="000000"/>
+              <w:start w:val="single" w:sz="4" w:space="0" w:color="000000"/>
+              <w:bottom w:val="single" w:sz="4" w:space="0" w:color="000000"/>
+              <w:end w:val="single" w:sz="4" w:space="0" w:color="000000"/>
+            </w:tcBorders>
+          </w:tcPr>
+          <w:p>
+            <w:pPr>
+              <w:pStyle w:val="Normal"/>
+              <w:spacing w:before="0" w:after="160"/>
+              <w:rPr>
+                <w:lang w:val="en-GB"/>
+              </w:rPr>
+            </w:pPr>
+            <w:r>
+              <w:rPr>
+                <w:b/>
+                <w:color w:val="000000"/>
+                <w:sz w:val="22"/>
+                <w:u w:val="none"/>
+                <w:lang w:val="en-GB"/>
+              </w:rPr>
+              <w:t>{#health_chestDisorders == 'YES'}</w:t>
+            </w:r>
+            <w:r>
+              <w:rPr>
+                <w:rFonts w:ascii="AppleSymbols" w:hAnsi="AppleSymbols"/>
+                <w:b/>
+                <w:color w:val="000000"/>
+                <w:sz w:val="22"/>
+                <w:u w:val="none"/>
+                <w:lang w:val="en-GB"/>
+              </w:rPr>
+              <w:t>✓</w:t>
+            </w:r>
+            <w:r>
+              <w:rPr>
+                <w:b/>
+                <w:color w:val="000000"/>
+                <w:sz w:val="22"/>
+                <w:u w:val="none"/>
+                <w:lang w:val="en-GB"/>
+              </w:rPr>
+              <w:t>{/}</w:t>
+            </w:r>
           </w:p>
         </w:tc>
         <w:tc>
@@ -951,56 +890,59 @@
               <w:pStyle w:val="Normal"/>
               <w:spacing w:before="0" w:after="160"/>
               <w:rPr>
-                <w:b/>
-                <w:lang w:val="en-GB"/>
-              </w:rPr>
-            </w:pPr>
-            <w:r>
-              <w:rPr/>
-              <w:drawing>
-                <wp:inline distT="0" distB="0" distL="0" distR="0">
-                  <wp:extent cx="123825" cy="208915"/>
-                  <wp:effectExtent l="0" t="0" r="0" b="0"/>
-                  <wp:docPr id="5" name="Image5" descr="Checkmark with solid fill"/>
-                  <wp:cNvGraphicFramePr>
-                    <a:graphicFrameLocks xmlns:a="http://schemas.openxmlformats.org/drawingml/2006/main" noChangeAspect="1"/>
-                  </wp:cNvGraphicFramePr>
-                  <a:graphic xmlns:a="http://schemas.openxmlformats.org/drawingml/2006/main">
-                    <a:graphicData uri="http://schemas.openxmlformats.org/drawingml/2006/picture">
-                      <pic:pic xmlns:pic="http://schemas.openxmlformats.org/drawingml/2006/picture">
-                        <pic:nvPicPr>
-                          <pic:cNvPr id="5" name="Image5" descr="Checkmark with solid fill"/>
-                          <pic:cNvPicPr>
-                            <a:picLocks noChangeAspect="1" noChangeArrowheads="1"/>
-                          </pic:cNvPicPr>
-                        </pic:nvPicPr>
-                        <pic:blipFill>
-                          <a:blip r:embed="rId10">
-                            <a:extLst>
-                              <a:ext uri="{96DAC541-7B7A-43D3-8B79-37D633B846F1}">
-                                <asvg:svgBlip xmlns:asvg="http://schemas.microsoft.com/office/drawing/2016/SVG/main" r:embed="rId11"/>
-                              </a:ext>
-                            </a:extLst>
-                          </a:blip>
-                          <a:stretch>
-                            <a:fillRect/>
-                          </a:stretch>
-                        </pic:blipFill>
-                        <pic:spPr bwMode="auto">
-                          <a:xfrm>
-                            <a:off x="0" y="0"/>
-                            <a:ext cx="123825" cy="208915"/>
-                          </a:xfrm>
-                          <a:prstGeom prst="rect">
-                            <a:avLst/>
-                          </a:prstGeom>
-                          <a:noFill/>
-                        </pic:spPr>
-                      </pic:pic>
-                    </a:graphicData>
-                  </a:graphic>
-                </wp:inline>
-              </w:drawing>
+                <w:lang w:val="en-GB"/>
+              </w:rPr>
+            </w:pPr>
+            <w:r>
+              <w:rPr>
+                <w:b/>
+                <w:color w:val="000000"/>
+                <w:sz w:val="22"/>
+                <w:u w:val="none"/>
+                <w:lang w:val="en-GB"/>
+              </w:rPr>
+              <w:t>{#health_chestDisorders == '</w:t>
+            </w:r>
+            <w:r>
+              <w:rPr>
+                <w:b/>
+                <w:color w:val="000000"/>
+                <w:sz w:val="22"/>
+                <w:u w:val="none"/>
+                <w:lang w:val="en-GB"/>
+              </w:rPr>
+              <w:t>NO</w:t>
+            </w:r>
+            <w:r>
+              <w:rPr>
+                <w:b/>
+                <w:color w:val="000000"/>
+                <w:sz w:val="22"/>
+                <w:u w:val="none"/>
+                <w:lang w:val="en-GB"/>
+              </w:rPr>
+              <w:t>'}</w:t>
+            </w:r>
+            <w:r>
+              <w:rPr>
+                <w:rFonts w:ascii="AppleSymbols" w:hAnsi="AppleSymbols"/>
+                <w:b/>
+                <w:color w:val="000000"/>
+                <w:sz w:val="22"/>
+                <w:u w:val="none"/>
+                <w:lang w:val="en-GB"/>
+              </w:rPr>
+              <w:t>✓</w:t>
+            </w:r>
+            <w:r>
+              <w:rPr>
+                <w:b/>
+                <w:color w:val="000000"/>
+                <w:sz w:val="22"/>
+                <w:u w:val="none"/>
+                <w:lang w:val="en-GB"/>
+              </w:rPr>
+              <w:t>{/}</w:t>
             </w:r>
           </w:p>
         </w:tc>
@@ -1009,7 +951,7 @@
         <w:trPr/>
         <w:tc>
           <w:tcPr>
-            <w:tcW w:w="8715" w:type="dxa"/>
+            <w:tcW w:w="8714" w:type="dxa"/>
             <w:tcBorders>
               <w:top w:val="single" w:sz="4" w:space="0" w:color="000000"/>
               <w:start w:val="single" w:sz="4" w:space="0" w:color="000000"/>
@@ -1037,65 +979,52 @@
         </w:tc>
         <w:tc>
           <w:tcPr>
-            <w:tcW w:w="609" w:type="dxa"/>
-            <w:tcBorders>
-              <w:top w:val="single" w:sz="4" w:space="0" w:color="000000"/>
-              <w:start w:val="single" w:sz="4" w:space="0" w:color="000000"/>
-              <w:bottom w:val="single" w:sz="4" w:space="0" w:color="000000"/>
-              <w:end w:val="single" w:sz="4" w:space="0" w:color="000000"/>
-            </w:tcBorders>
-          </w:tcPr>
-          <w:p>
-            <w:pPr>
-              <w:pStyle w:val="Normal"/>
-              <w:spacing w:before="0" w:after="160"/>
-              <w:rPr>
-                <w:b/>
-                <w:lang w:val="en-GB"/>
-              </w:rPr>
-            </w:pPr>
-            <w:r>
-              <w:fldChar w:fldCharType="begin">
-                <w:ffData>
-                  <w:name w:val="Check7 Copy 2"/>
-                  <w:enabled/>
-                  <w:calcOnExit w:val="0"/>
-                  <w:checkBox>
-                    <w:sizeAuto/>
-                  </w:checkBox>
-                </w:ffData>
-              </w:fldChar>
-            </w:r>
-            <w:r>
-              <w:rPr>
-                <w:b/>
-                <w:lang w:val="en-GB"/>
-              </w:rPr>
-              <w:instrText xml:space="preserve"> FORMCHECKBOX </w:instrText>
-            </w:r>
-            <w:r>
-              <w:rPr>
-                <w:b/>
-                <w:lang w:val="en-GB"/>
-              </w:rPr>
-              <w:fldChar w:fldCharType="separate"/>
-            </w:r>
-            <w:bookmarkStart w:id="14" w:name="Check7_Copy_2"/>
-            <w:bookmarkStart w:id="15" w:name="Check7_Copy_2"/>
-            <w:bookmarkEnd w:id="15"/>
-            <w:r/>
-            <w:r>
-              <w:rPr>
-                <w:b/>
-                <w:lang w:val="en-GB"/>
-              </w:rPr>
-              <w:fldChar w:fldCharType="end"/>
-            </w:r>
-            <w:r>
-              <w:rPr>
-                <w:b/>
-                <w:lang w:val="en-GB"/>
-              </w:rPr>
+            <w:tcW w:w="610" w:type="dxa"/>
+            <w:tcBorders>
+              <w:top w:val="single" w:sz="4" w:space="0" w:color="000000"/>
+              <w:start w:val="single" w:sz="4" w:space="0" w:color="000000"/>
+              <w:bottom w:val="single" w:sz="4" w:space="0" w:color="000000"/>
+              <w:end w:val="single" w:sz="4" w:space="0" w:color="000000"/>
+            </w:tcBorders>
+          </w:tcPr>
+          <w:p>
+            <w:pPr>
+              <w:pStyle w:val="Normal"/>
+              <w:spacing w:before="0" w:after="160"/>
+              <w:rPr>
+                <w:lang w:val="en-GB"/>
+              </w:rPr>
+            </w:pPr>
+            <w:r>
+              <w:rPr>
+                <w:b/>
+                <w:color w:val="000000"/>
+                <w:sz w:val="22"/>
+                <w:u w:val="none"/>
+                <w:lang w:val="en-GB"/>
+              </w:rPr>
+              <w:t>{#health_strictMedication == 'YES'}</w:t>
+            </w:r>
+            <w:r>
+              <w:rPr>
+                <w:rFonts w:ascii="AppleSymbols" w:hAnsi="AppleSymbols"/>
+                <w:b/>
+                <w:color w:val="000000"/>
+                <w:sz w:val="22"/>
+                <w:u w:val="none"/>
+                <w:lang w:val="en-GB"/>
+              </w:rPr>
+              <w:t>✓</w:t>
+            </w:r>
+            <w:r>
+              <w:rPr>
+                <w:b/>
+                <w:color w:val="000000"/>
+                <w:sz w:val="22"/>
+                <w:u w:val="none"/>
+                <w:lang w:val="en-GB"/>
+              </w:rPr>
+              <w:t>{/}</w:t>
             </w:r>
           </w:p>
         </w:tc>
@@ -1114,56 +1043,59 @@
               <w:pStyle w:val="Normal"/>
               <w:spacing w:before="0" w:after="160"/>
               <w:rPr>
-                <w:b/>
-                <w:lang w:val="en-GB"/>
-              </w:rPr>
-            </w:pPr>
-            <w:r>
-              <w:rPr/>
-              <w:drawing>
-                <wp:inline distT="0" distB="0" distL="0" distR="0">
-                  <wp:extent cx="123825" cy="208915"/>
-                  <wp:effectExtent l="0" t="0" r="0" b="0"/>
-                  <wp:docPr id="6" name="Image6" descr="Checkmark with solid fill"/>
-                  <wp:cNvGraphicFramePr>
-                    <a:graphicFrameLocks xmlns:a="http://schemas.openxmlformats.org/drawingml/2006/main" noChangeAspect="1"/>
-                  </wp:cNvGraphicFramePr>
-                  <a:graphic xmlns:a="http://schemas.openxmlformats.org/drawingml/2006/main">
-                    <a:graphicData uri="http://schemas.openxmlformats.org/drawingml/2006/picture">
-                      <pic:pic xmlns:pic="http://schemas.openxmlformats.org/drawingml/2006/picture">
-                        <pic:nvPicPr>
-                          <pic:cNvPr id="6" name="Image6" descr="Checkmark with solid fill"/>
-                          <pic:cNvPicPr>
-                            <a:picLocks noChangeAspect="1" noChangeArrowheads="1"/>
-                          </pic:cNvPicPr>
-                        </pic:nvPicPr>
-                        <pic:blipFill>
-                          <a:blip r:embed="rId12">
-                            <a:extLst>
-                              <a:ext uri="{96DAC541-7B7A-43D3-8B79-37D633B846F1}">
-                                <asvg:svgBlip xmlns:asvg="http://schemas.microsoft.com/office/drawing/2016/SVG/main" r:embed="rId13"/>
-                              </a:ext>
-                            </a:extLst>
-                          </a:blip>
-                          <a:stretch>
-                            <a:fillRect/>
-                          </a:stretch>
-                        </pic:blipFill>
-                        <pic:spPr bwMode="auto">
-                          <a:xfrm>
-                            <a:off x="0" y="0"/>
-                            <a:ext cx="123825" cy="208915"/>
-                          </a:xfrm>
-                          <a:prstGeom prst="rect">
-                            <a:avLst/>
-                          </a:prstGeom>
-                          <a:noFill/>
-                        </pic:spPr>
-                      </pic:pic>
-                    </a:graphicData>
-                  </a:graphic>
-                </wp:inline>
-              </w:drawing>
+                <w:lang w:val="en-GB"/>
+              </w:rPr>
+            </w:pPr>
+            <w:r>
+              <w:rPr>
+                <w:b/>
+                <w:color w:val="000000"/>
+                <w:sz w:val="22"/>
+                <w:u w:val="none"/>
+                <w:lang w:val="en-GB"/>
+              </w:rPr>
+              <w:t>{#health_strictMedication == '</w:t>
+            </w:r>
+            <w:r>
+              <w:rPr>
+                <w:b/>
+                <w:color w:val="000000"/>
+                <w:sz w:val="22"/>
+                <w:u w:val="none"/>
+                <w:lang w:val="en-GB"/>
+              </w:rPr>
+              <w:t>NO</w:t>
+            </w:r>
+            <w:r>
+              <w:rPr>
+                <w:b/>
+                <w:color w:val="000000"/>
+                <w:sz w:val="22"/>
+                <w:u w:val="none"/>
+                <w:lang w:val="en-GB"/>
+              </w:rPr>
+              <w:t>'}</w:t>
+            </w:r>
+            <w:r>
+              <w:rPr>
+                <w:rFonts w:ascii="AppleSymbols" w:hAnsi="AppleSymbols"/>
+                <w:b/>
+                <w:color w:val="000000"/>
+                <w:sz w:val="22"/>
+                <w:u w:val="none"/>
+                <w:lang w:val="en-GB"/>
+              </w:rPr>
+              <w:t>✓</w:t>
+            </w:r>
+            <w:r>
+              <w:rPr>
+                <w:b/>
+                <w:color w:val="000000"/>
+                <w:sz w:val="22"/>
+                <w:u w:val="none"/>
+                <w:lang w:val="en-GB"/>
+              </w:rPr>
+              <w:t>{/}</w:t>
             </w:r>
           </w:p>
         </w:tc>
@@ -1172,7 +1104,7 @@
         <w:trPr/>
         <w:tc>
           <w:tcPr>
-            <w:tcW w:w="8715" w:type="dxa"/>
+            <w:tcW w:w="8714" w:type="dxa"/>
             <w:tcBorders>
               <w:top w:val="single" w:sz="4" w:space="0" w:color="000000"/>
               <w:start w:val="single" w:sz="4" w:space="0" w:color="000000"/>
@@ -1200,65 +1132,52 @@
         </w:tc>
         <w:tc>
           <w:tcPr>
-            <w:tcW w:w="609" w:type="dxa"/>
-            <w:tcBorders>
-              <w:top w:val="single" w:sz="4" w:space="0" w:color="000000"/>
-              <w:start w:val="single" w:sz="4" w:space="0" w:color="000000"/>
-              <w:bottom w:val="single" w:sz="4" w:space="0" w:color="000000"/>
-              <w:end w:val="single" w:sz="4" w:space="0" w:color="000000"/>
-            </w:tcBorders>
-          </w:tcPr>
-          <w:p>
-            <w:pPr>
-              <w:pStyle w:val="Normal"/>
-              <w:spacing w:before="0" w:after="160"/>
-              <w:rPr>
-                <w:b/>
-                <w:lang w:val="en-GB"/>
-              </w:rPr>
-            </w:pPr>
-            <w:r>
-              <w:fldChar w:fldCharType="begin">
-                <w:ffData>
-                  <w:name w:val="Check7 Copy 3"/>
-                  <w:enabled/>
-                  <w:calcOnExit w:val="0"/>
-                  <w:checkBox>
-                    <w:sizeAuto/>
-                  </w:checkBox>
-                </w:ffData>
-              </w:fldChar>
-            </w:r>
-            <w:r>
-              <w:rPr>
-                <w:b/>
-                <w:lang w:val="en-GB"/>
-              </w:rPr>
-              <w:instrText xml:space="preserve"> FORMCHECKBOX </w:instrText>
-            </w:r>
-            <w:r>
-              <w:rPr>
-                <w:b/>
-                <w:lang w:val="en-GB"/>
-              </w:rPr>
-              <w:fldChar w:fldCharType="separate"/>
-            </w:r>
-            <w:bookmarkStart w:id="16" w:name="Check7_Copy_3"/>
-            <w:bookmarkStart w:id="17" w:name="Check7_Copy_3"/>
-            <w:bookmarkEnd w:id="17"/>
-            <w:r/>
-            <w:r>
-              <w:rPr>
-                <w:b/>
-                <w:lang w:val="en-GB"/>
-              </w:rPr>
-              <w:fldChar w:fldCharType="end"/>
-            </w:r>
-            <w:r>
-              <w:rPr>
-                <w:b/>
-                <w:lang w:val="en-GB"/>
-              </w:rPr>
+            <w:tcW w:w="610" w:type="dxa"/>
+            <w:tcBorders>
+              <w:top w:val="single" w:sz="4" w:space="0" w:color="000000"/>
+              <w:start w:val="single" w:sz="4" w:space="0" w:color="000000"/>
+              <w:bottom w:val="single" w:sz="4" w:space="0" w:color="000000"/>
+              <w:end w:val="single" w:sz="4" w:space="0" w:color="000000"/>
+            </w:tcBorders>
+          </w:tcPr>
+          <w:p>
+            <w:pPr>
+              <w:pStyle w:val="Normal"/>
+              <w:spacing w:before="0" w:after="160"/>
+              <w:rPr>
+                <w:lang w:val="en-GB"/>
+              </w:rPr>
+            </w:pPr>
+            <w:r>
+              <w:rPr>
+                <w:b/>
+                <w:color w:val="000000"/>
+                <w:sz w:val="22"/>
+                <w:u w:val="none"/>
+                <w:lang w:val="en-GB"/>
+              </w:rPr>
+              <w:t>{#health_mealTiming == 'YES'}</w:t>
+            </w:r>
+            <w:r>
+              <w:rPr>
+                <w:rFonts w:ascii="AppleSymbols" w:hAnsi="AppleSymbols"/>
+                <w:b/>
+                <w:color w:val="000000"/>
+                <w:sz w:val="22"/>
+                <w:u w:val="none"/>
+                <w:lang w:val="en-GB"/>
+              </w:rPr>
+              <w:t>✓</w:t>
+            </w:r>
+            <w:r>
+              <w:rPr>
+                <w:b/>
+                <w:color w:val="000000"/>
+                <w:sz w:val="22"/>
+                <w:u w:val="none"/>
+                <w:lang w:val="en-GB"/>
+              </w:rPr>
+              <w:t>{/}</w:t>
             </w:r>
           </w:p>
         </w:tc>
@@ -1277,56 +1196,59 @@
               <w:pStyle w:val="Normal"/>
               <w:spacing w:before="0" w:after="160"/>
               <w:rPr>
-                <w:b/>
-                <w:lang w:val="en-GB"/>
-              </w:rPr>
-            </w:pPr>
-            <w:r>
-              <w:rPr/>
-              <w:drawing>
-                <wp:inline distT="0" distB="0" distL="0" distR="0">
-                  <wp:extent cx="123825" cy="208915"/>
-                  <wp:effectExtent l="0" t="0" r="0" b="0"/>
-                  <wp:docPr id="7" name="Image7" descr="Checkmark with solid fill"/>
-                  <wp:cNvGraphicFramePr>
-                    <a:graphicFrameLocks xmlns:a="http://schemas.openxmlformats.org/drawingml/2006/main" noChangeAspect="1"/>
-                  </wp:cNvGraphicFramePr>
-                  <a:graphic xmlns:a="http://schemas.openxmlformats.org/drawingml/2006/main">
-                    <a:graphicData uri="http://schemas.openxmlformats.org/drawingml/2006/picture">
-                      <pic:pic xmlns:pic="http://schemas.openxmlformats.org/drawingml/2006/picture">
-                        <pic:nvPicPr>
-                          <pic:cNvPr id="7" name="Image7" descr="Checkmark with solid fill"/>
-                          <pic:cNvPicPr>
-                            <a:picLocks noChangeAspect="1" noChangeArrowheads="1"/>
-                          </pic:cNvPicPr>
-                        </pic:nvPicPr>
-                        <pic:blipFill>
-                          <a:blip r:embed="rId14">
-                            <a:extLst>
-                              <a:ext uri="{96DAC541-7B7A-43D3-8B79-37D633B846F1}">
-                                <asvg:svgBlip xmlns:asvg="http://schemas.microsoft.com/office/drawing/2016/SVG/main" r:embed="rId15"/>
-                              </a:ext>
-                            </a:extLst>
-                          </a:blip>
-                          <a:stretch>
-                            <a:fillRect/>
-                          </a:stretch>
-                        </pic:blipFill>
-                        <pic:spPr bwMode="auto">
-                          <a:xfrm>
-                            <a:off x="0" y="0"/>
-                            <a:ext cx="123825" cy="208915"/>
-                          </a:xfrm>
-                          <a:prstGeom prst="rect">
-                            <a:avLst/>
-                          </a:prstGeom>
-                          <a:noFill/>
-                        </pic:spPr>
-                      </pic:pic>
-                    </a:graphicData>
-                  </a:graphic>
-                </wp:inline>
-              </w:drawing>
+                <w:lang w:val="en-GB"/>
+              </w:rPr>
+            </w:pPr>
+            <w:r>
+              <w:rPr>
+                <w:b/>
+                <w:color w:val="000000"/>
+                <w:sz w:val="22"/>
+                <w:u w:val="none"/>
+                <w:lang w:val="en-GB"/>
+              </w:rPr>
+              <w:t>{#health_mealTiming == '</w:t>
+            </w:r>
+            <w:r>
+              <w:rPr>
+                <w:b/>
+                <w:color w:val="000000"/>
+                <w:sz w:val="22"/>
+                <w:u w:val="none"/>
+                <w:lang w:val="en-GB"/>
+              </w:rPr>
+              <w:t>NO</w:t>
+            </w:r>
+            <w:r>
+              <w:rPr>
+                <w:b/>
+                <w:color w:val="000000"/>
+                <w:sz w:val="22"/>
+                <w:u w:val="none"/>
+                <w:lang w:val="en-GB"/>
+              </w:rPr>
+              <w:t>'}</w:t>
+            </w:r>
+            <w:r>
+              <w:rPr>
+                <w:rFonts w:ascii="AppleSymbols" w:hAnsi="AppleSymbols"/>
+                <w:b/>
+                <w:color w:val="000000"/>
+                <w:sz w:val="22"/>
+                <w:u w:val="none"/>
+                <w:lang w:val="en-GB"/>
+              </w:rPr>
+              <w:t>✓</w:t>
+            </w:r>
+            <w:r>
+              <w:rPr>
+                <w:b/>
+                <w:color w:val="000000"/>
+                <w:sz w:val="22"/>
+                <w:u w:val="none"/>
+                <w:lang w:val="en-GB"/>
+              </w:rPr>
+              <w:t>{/}</w:t>
             </w:r>
           </w:p>
         </w:tc>
@@ -1335,7 +1257,7 @@
         <w:trPr/>
         <w:tc>
           <w:tcPr>
-            <w:tcW w:w="8715" w:type="dxa"/>
+            <w:tcW w:w="8714" w:type="dxa"/>
             <w:tcBorders>
               <w:top w:val="single" w:sz="4" w:space="0" w:color="000000"/>
               <w:start w:val="single" w:sz="4" w:space="0" w:color="000000"/>
@@ -1363,65 +1285,52 @@
         </w:tc>
         <w:tc>
           <w:tcPr>
-            <w:tcW w:w="609" w:type="dxa"/>
-            <w:tcBorders>
-              <w:top w:val="single" w:sz="4" w:space="0" w:color="000000"/>
-              <w:start w:val="single" w:sz="4" w:space="0" w:color="000000"/>
-              <w:bottom w:val="single" w:sz="4" w:space="0" w:color="000000"/>
-              <w:end w:val="single" w:sz="4" w:space="0" w:color="000000"/>
-            </w:tcBorders>
-          </w:tcPr>
-          <w:p>
-            <w:pPr>
-              <w:pStyle w:val="Normal"/>
-              <w:spacing w:before="0" w:after="160"/>
-              <w:rPr>
-                <w:b/>
-                <w:lang w:val="en-GB"/>
-              </w:rPr>
-            </w:pPr>
-            <w:r>
-              <w:fldChar w:fldCharType="begin">
-                <w:ffData>
-                  <w:name w:val="Check7 Copy 4"/>
-                  <w:enabled/>
-                  <w:calcOnExit w:val="0"/>
-                  <w:checkBox>
-                    <w:sizeAuto/>
-                  </w:checkBox>
-                </w:ffData>
-              </w:fldChar>
-            </w:r>
-            <w:r>
-              <w:rPr>
-                <w:b/>
-                <w:lang w:val="en-GB"/>
-              </w:rPr>
-              <w:instrText xml:space="preserve"> FORMCHECKBOX </w:instrText>
-            </w:r>
-            <w:r>
-              <w:rPr>
-                <w:b/>
-                <w:lang w:val="en-GB"/>
-              </w:rPr>
-              <w:fldChar w:fldCharType="separate"/>
-            </w:r>
-            <w:bookmarkStart w:id="18" w:name="Check7_Copy_4"/>
-            <w:bookmarkStart w:id="19" w:name="Check7_Copy_4"/>
-            <w:bookmarkEnd w:id="19"/>
-            <w:r/>
-            <w:r>
-              <w:rPr>
-                <w:b/>
-                <w:lang w:val="en-GB"/>
-              </w:rPr>
-              <w:fldChar w:fldCharType="end"/>
-            </w:r>
-            <w:r>
-              <w:rPr>
-                <w:b/>
-                <w:lang w:val="en-GB"/>
-              </w:rPr>
+            <w:tcW w:w="610" w:type="dxa"/>
+            <w:tcBorders>
+              <w:top w:val="single" w:sz="4" w:space="0" w:color="000000"/>
+              <w:start w:val="single" w:sz="4" w:space="0" w:color="000000"/>
+              <w:bottom w:val="single" w:sz="4" w:space="0" w:color="000000"/>
+              <w:end w:val="single" w:sz="4" w:space="0" w:color="000000"/>
+            </w:tcBorders>
+          </w:tcPr>
+          <w:p>
+            <w:pPr>
+              <w:pStyle w:val="Normal"/>
+              <w:spacing w:before="0" w:after="160"/>
+              <w:rPr>
+                <w:lang w:val="en-GB"/>
+              </w:rPr>
+            </w:pPr>
+            <w:r>
+              <w:rPr>
+                <w:b/>
+                <w:color w:val="000000"/>
+                <w:sz w:val="22"/>
+                <w:u w:val="none"/>
+                <w:lang w:val="en-GB"/>
+              </w:rPr>
+              <w:t>{#health_mentalHealth == 'YES'}</w:t>
+            </w:r>
+            <w:r>
+              <w:rPr>
+                <w:rFonts w:ascii="AppleSymbols" w:hAnsi="AppleSymbols"/>
+                <w:b/>
+                <w:color w:val="000000"/>
+                <w:sz w:val="22"/>
+                <w:u w:val="none"/>
+                <w:lang w:val="en-GB"/>
+              </w:rPr>
+              <w:t>✓</w:t>
+            </w:r>
+            <w:r>
+              <w:rPr>
+                <w:b/>
+                <w:color w:val="000000"/>
+                <w:sz w:val="22"/>
+                <w:u w:val="none"/>
+                <w:lang w:val="en-GB"/>
+              </w:rPr>
+              <w:t>{/}</w:t>
             </w:r>
           </w:p>
         </w:tc>
@@ -1440,56 +1349,59 @@
               <w:pStyle w:val="Normal"/>
               <w:spacing w:before="0" w:after="160"/>
               <w:rPr>
-                <w:b/>
-                <w:lang w:val="en-GB"/>
-              </w:rPr>
-            </w:pPr>
-            <w:r>
-              <w:rPr/>
-              <w:drawing>
-                <wp:inline distT="0" distB="0" distL="0" distR="0">
-                  <wp:extent cx="123825" cy="208915"/>
-                  <wp:effectExtent l="0" t="0" r="0" b="0"/>
-                  <wp:docPr id="8" name="Image8" descr="Checkmark with solid fill"/>
-                  <wp:cNvGraphicFramePr>
-                    <a:graphicFrameLocks xmlns:a="http://schemas.openxmlformats.org/drawingml/2006/main" noChangeAspect="1"/>
-                  </wp:cNvGraphicFramePr>
-                  <a:graphic xmlns:a="http://schemas.openxmlformats.org/drawingml/2006/main">
-                    <a:graphicData uri="http://schemas.openxmlformats.org/drawingml/2006/picture">
-                      <pic:pic xmlns:pic="http://schemas.openxmlformats.org/drawingml/2006/picture">
-                        <pic:nvPicPr>
-                          <pic:cNvPr id="8" name="Image8" descr="Checkmark with solid fill"/>
-                          <pic:cNvPicPr>
-                            <a:picLocks noChangeAspect="1" noChangeArrowheads="1"/>
-                          </pic:cNvPicPr>
-                        </pic:nvPicPr>
-                        <pic:blipFill>
-                          <a:blip r:embed="rId16">
-                            <a:extLst>
-                              <a:ext uri="{96DAC541-7B7A-43D3-8B79-37D633B846F1}">
-                                <asvg:svgBlip xmlns:asvg="http://schemas.microsoft.com/office/drawing/2016/SVG/main" r:embed="rId17"/>
-                              </a:ext>
-                            </a:extLst>
-                          </a:blip>
-                          <a:stretch>
-                            <a:fillRect/>
-                          </a:stretch>
-                        </pic:blipFill>
-                        <pic:spPr bwMode="auto">
-                          <a:xfrm>
-                            <a:off x="0" y="0"/>
-                            <a:ext cx="123825" cy="208915"/>
-                          </a:xfrm>
-                          <a:prstGeom prst="rect">
-                            <a:avLst/>
-                          </a:prstGeom>
-                          <a:noFill/>
-                        </pic:spPr>
-                      </pic:pic>
-                    </a:graphicData>
-                  </a:graphic>
-                </wp:inline>
-              </w:drawing>
+                <w:lang w:val="en-GB"/>
+              </w:rPr>
+            </w:pPr>
+            <w:r>
+              <w:rPr>
+                <w:b/>
+                <w:color w:val="000000"/>
+                <w:sz w:val="22"/>
+                <w:u w:val="none"/>
+                <w:lang w:val="en-GB"/>
+              </w:rPr>
+              <w:t>{#health_mentalHealth == '</w:t>
+            </w:r>
+            <w:r>
+              <w:rPr>
+                <w:b/>
+                <w:color w:val="000000"/>
+                <w:sz w:val="22"/>
+                <w:u w:val="none"/>
+                <w:lang w:val="en-GB"/>
+              </w:rPr>
+              <w:t>NO</w:t>
+            </w:r>
+            <w:r>
+              <w:rPr>
+                <w:b/>
+                <w:color w:val="000000"/>
+                <w:sz w:val="22"/>
+                <w:u w:val="none"/>
+                <w:lang w:val="en-GB"/>
+              </w:rPr>
+              <w:t>'}</w:t>
+            </w:r>
+            <w:r>
+              <w:rPr>
+                <w:rFonts w:ascii="AppleSymbols" w:hAnsi="AppleSymbols"/>
+                <w:b/>
+                <w:color w:val="000000"/>
+                <w:sz w:val="22"/>
+                <w:u w:val="none"/>
+                <w:lang w:val="en-GB"/>
+              </w:rPr>
+              <w:t>✓</w:t>
+            </w:r>
+            <w:r>
+              <w:rPr>
+                <w:b/>
+                <w:color w:val="000000"/>
+                <w:sz w:val="22"/>
+                <w:u w:val="none"/>
+                <w:lang w:val="en-GB"/>
+              </w:rPr>
+              <w:t>{/}</w:t>
             </w:r>
           </w:p>
         </w:tc>
@@ -1498,7 +1410,7 @@
         <w:trPr/>
         <w:tc>
           <w:tcPr>
-            <w:tcW w:w="8715" w:type="dxa"/>
+            <w:tcW w:w="8714" w:type="dxa"/>
             <w:tcBorders>
               <w:top w:val="single" w:sz="4" w:space="0" w:color="000000"/>
               <w:start w:val="single" w:sz="4" w:space="0" w:color="000000"/>
@@ -1526,65 +1438,52 @@
         </w:tc>
         <w:tc>
           <w:tcPr>
-            <w:tcW w:w="609" w:type="dxa"/>
-            <w:tcBorders>
-              <w:top w:val="single" w:sz="4" w:space="0" w:color="000000"/>
-              <w:start w:val="single" w:sz="4" w:space="0" w:color="000000"/>
-              <w:bottom w:val="single" w:sz="4" w:space="0" w:color="000000"/>
-              <w:end w:val="single" w:sz="4" w:space="0" w:color="000000"/>
-            </w:tcBorders>
-          </w:tcPr>
-          <w:p>
-            <w:pPr>
-              <w:pStyle w:val="Normal"/>
-              <w:spacing w:before="0" w:after="160"/>
-              <w:rPr>
-                <w:b/>
-                <w:lang w:val="en-GB"/>
-              </w:rPr>
-            </w:pPr>
-            <w:r>
-              <w:fldChar w:fldCharType="begin">
-                <w:ffData>
-                  <w:name w:val="Check7 Copy 5"/>
-                  <w:enabled/>
-                  <w:calcOnExit w:val="0"/>
-                  <w:checkBox>
-                    <w:sizeAuto/>
-                  </w:checkBox>
-                </w:ffData>
-              </w:fldChar>
-            </w:r>
-            <w:r>
-              <w:rPr>
-                <w:b/>
-                <w:lang w:val="en-GB"/>
-              </w:rPr>
-              <w:instrText xml:space="preserve"> FORMCHECKBOX </w:instrText>
-            </w:r>
-            <w:r>
-              <w:rPr>
-                <w:b/>
-                <w:lang w:val="en-GB"/>
-              </w:rPr>
-              <w:fldChar w:fldCharType="separate"/>
-            </w:r>
-            <w:bookmarkStart w:id="20" w:name="Check7_Copy_5"/>
-            <w:bookmarkStart w:id="21" w:name="Check7_Copy_5"/>
-            <w:bookmarkEnd w:id="21"/>
-            <w:r/>
-            <w:r>
-              <w:rPr>
-                <w:b/>
-                <w:lang w:val="en-GB"/>
-              </w:rPr>
-              <w:fldChar w:fldCharType="end"/>
-            </w:r>
-            <w:r>
-              <w:rPr>
-                <w:b/>
-                <w:lang w:val="en-GB"/>
-              </w:rPr>
+            <w:tcW w:w="610" w:type="dxa"/>
+            <w:tcBorders>
+              <w:top w:val="single" w:sz="4" w:space="0" w:color="000000"/>
+              <w:start w:val="single" w:sz="4" w:space="0" w:color="000000"/>
+              <w:bottom w:val="single" w:sz="4" w:space="0" w:color="000000"/>
+              <w:end w:val="single" w:sz="4" w:space="0" w:color="000000"/>
+            </w:tcBorders>
+          </w:tcPr>
+          <w:p>
+            <w:pPr>
+              <w:pStyle w:val="Normal"/>
+              <w:spacing w:before="0" w:after="160"/>
+              <w:rPr>
+                <w:lang w:val="en-GB"/>
+              </w:rPr>
+            </w:pPr>
+            <w:r>
+              <w:rPr>
+                <w:b/>
+                <w:color w:val="000000"/>
+                <w:sz w:val="22"/>
+                <w:u w:val="none"/>
+                <w:lang w:val="en-GB"/>
+              </w:rPr>
+              <w:t>{#health_otherConditions == 'YES'}</w:t>
+            </w:r>
+            <w:r>
+              <w:rPr>
+                <w:rFonts w:ascii="AppleSymbols" w:hAnsi="AppleSymbols"/>
+                <w:b/>
+                <w:color w:val="000000"/>
+                <w:sz w:val="22"/>
+                <w:u w:val="none"/>
+                <w:lang w:val="en-GB"/>
+              </w:rPr>
+              <w:t>✓</w:t>
+            </w:r>
+            <w:r>
+              <w:rPr>
+                <w:b/>
+                <w:color w:val="000000"/>
+                <w:sz w:val="22"/>
+                <w:u w:val="none"/>
+                <w:lang w:val="en-GB"/>
+              </w:rPr>
+              <w:t>{/}</w:t>
             </w:r>
           </w:p>
         </w:tc>
@@ -1603,56 +1502,59 @@
               <w:pStyle w:val="Normal"/>
               <w:spacing w:before="0" w:after="160"/>
               <w:rPr>
-                <w:b/>
-                <w:lang w:val="en-GB"/>
-              </w:rPr>
-            </w:pPr>
-            <w:r>
-              <w:rPr/>
-              <w:drawing>
-                <wp:inline distT="0" distB="0" distL="0" distR="0">
-                  <wp:extent cx="123825" cy="208915"/>
-                  <wp:effectExtent l="0" t="0" r="0" b="0"/>
-                  <wp:docPr id="9" name="Image9" descr="Checkmark with solid fill"/>
-                  <wp:cNvGraphicFramePr>
-                    <a:graphicFrameLocks xmlns:a="http://schemas.openxmlformats.org/drawingml/2006/main" noChangeAspect="1"/>
-                  </wp:cNvGraphicFramePr>
-                  <a:graphic xmlns:a="http://schemas.openxmlformats.org/drawingml/2006/main">
-                    <a:graphicData uri="http://schemas.openxmlformats.org/drawingml/2006/picture">
-                      <pic:pic xmlns:pic="http://schemas.openxmlformats.org/drawingml/2006/picture">
-                        <pic:nvPicPr>
-                          <pic:cNvPr id="9" name="Image9" descr="Checkmark with solid fill"/>
-                          <pic:cNvPicPr>
-                            <a:picLocks noChangeAspect="1" noChangeArrowheads="1"/>
-                          </pic:cNvPicPr>
-                        </pic:nvPicPr>
-                        <pic:blipFill>
-                          <a:blip r:embed="rId18">
-                            <a:extLst>
-                              <a:ext uri="{96DAC541-7B7A-43D3-8B79-37D633B846F1}">
-                                <asvg:svgBlip xmlns:asvg="http://schemas.microsoft.com/office/drawing/2016/SVG/main" r:embed="rId19"/>
-                              </a:ext>
-                            </a:extLst>
-                          </a:blip>
-                          <a:stretch>
-                            <a:fillRect/>
-                          </a:stretch>
-                        </pic:blipFill>
-                        <pic:spPr bwMode="auto">
-                          <a:xfrm>
-                            <a:off x="0" y="0"/>
-                            <a:ext cx="123825" cy="208915"/>
-                          </a:xfrm>
-                          <a:prstGeom prst="rect">
-                            <a:avLst/>
-                          </a:prstGeom>
-                          <a:noFill/>
-                        </pic:spPr>
-                      </pic:pic>
-                    </a:graphicData>
-                  </a:graphic>
-                </wp:inline>
-              </w:drawing>
+                <w:lang w:val="en-GB"/>
+              </w:rPr>
+            </w:pPr>
+            <w:r>
+              <w:rPr>
+                <w:b/>
+                <w:color w:val="000000"/>
+                <w:sz w:val="22"/>
+                <w:u w:val="none"/>
+                <w:lang w:val="en-GB"/>
+              </w:rPr>
+              <w:t>{#health_otherConditions == '</w:t>
+            </w:r>
+            <w:r>
+              <w:rPr>
+                <w:b/>
+                <w:color w:val="000000"/>
+                <w:sz w:val="22"/>
+                <w:u w:val="none"/>
+                <w:lang w:val="en-GB"/>
+              </w:rPr>
+              <w:t>NO</w:t>
+            </w:r>
+            <w:r>
+              <w:rPr>
+                <w:b/>
+                <w:color w:val="000000"/>
+                <w:sz w:val="22"/>
+                <w:u w:val="none"/>
+                <w:lang w:val="en-GB"/>
+              </w:rPr>
+              <w:t>'}</w:t>
+            </w:r>
+            <w:r>
+              <w:rPr>
+                <w:rFonts w:ascii="AppleSymbols" w:hAnsi="AppleSymbols"/>
+                <w:b/>
+                <w:color w:val="000000"/>
+                <w:sz w:val="22"/>
+                <w:u w:val="none"/>
+                <w:lang w:val="en-GB"/>
+              </w:rPr>
+              <w:t>✓</w:t>
+            </w:r>
+            <w:r>
+              <w:rPr>
+                <w:b/>
+                <w:color w:val="000000"/>
+                <w:sz w:val="22"/>
+                <w:u w:val="none"/>
+                <w:lang w:val="en-GB"/>
+              </w:rPr>
+              <w:t>{/}</w:t>
             </w:r>
           </w:p>
         </w:tc>
@@ -1661,7 +1563,7 @@
         <w:trPr/>
         <w:tc>
           <w:tcPr>
-            <w:tcW w:w="8715" w:type="dxa"/>
+            <w:tcW w:w="8714" w:type="dxa"/>
             <w:tcBorders>
               <w:top w:val="single" w:sz="4" w:space="0" w:color="000000"/>
               <w:start w:val="single" w:sz="4" w:space="0" w:color="000000"/>
@@ -1687,65 +1589,52 @@
         </w:tc>
         <w:tc>
           <w:tcPr>
-            <w:tcW w:w="609" w:type="dxa"/>
-            <w:tcBorders>
-              <w:top w:val="single" w:sz="4" w:space="0" w:color="000000"/>
-              <w:start w:val="single" w:sz="4" w:space="0" w:color="000000"/>
-              <w:bottom w:val="single" w:sz="4" w:space="0" w:color="000000"/>
-              <w:end w:val="single" w:sz="4" w:space="0" w:color="000000"/>
-            </w:tcBorders>
-          </w:tcPr>
-          <w:p>
-            <w:pPr>
-              <w:pStyle w:val="Normal"/>
-              <w:spacing w:before="0" w:after="160"/>
-              <w:rPr>
-                <w:b/>
-                <w:lang w:val="en-GB"/>
-              </w:rPr>
-            </w:pPr>
-            <w:r>
-              <w:fldChar w:fldCharType="begin">
-                <w:ffData>
-                  <w:name w:val="Check7 Copy 6"/>
-                  <w:enabled/>
-                  <w:calcOnExit w:val="0"/>
-                  <w:checkBox>
-                    <w:sizeAuto/>
-                  </w:checkBox>
-                </w:ffData>
-              </w:fldChar>
-            </w:r>
-            <w:r>
-              <w:rPr>
-                <w:b/>
-                <w:lang w:val="en-GB"/>
-              </w:rPr>
-              <w:instrText xml:space="preserve"> FORMCHECKBOX </w:instrText>
-            </w:r>
-            <w:r>
-              <w:rPr>
-                <w:b/>
-                <w:lang w:val="en-GB"/>
-              </w:rPr>
-              <w:fldChar w:fldCharType="separate"/>
-            </w:r>
-            <w:bookmarkStart w:id="22" w:name="Check7_Copy_6"/>
-            <w:bookmarkStart w:id="23" w:name="Check7_Copy_6"/>
-            <w:bookmarkEnd w:id="23"/>
-            <w:r/>
-            <w:r>
-              <w:rPr>
-                <w:b/>
-                <w:lang w:val="en-GB"/>
-              </w:rPr>
-              <w:fldChar w:fldCharType="end"/>
-            </w:r>
-            <w:r>
-              <w:rPr>
-                <w:b/>
-                <w:lang w:val="en-GB"/>
-              </w:rPr>
+            <w:tcW w:w="610" w:type="dxa"/>
+            <w:tcBorders>
+              <w:top w:val="single" w:sz="4" w:space="0" w:color="000000"/>
+              <w:start w:val="single" w:sz="4" w:space="0" w:color="000000"/>
+              <w:bottom w:val="single" w:sz="4" w:space="0" w:color="000000"/>
+              <w:end w:val="single" w:sz="4" w:space="0" w:color="000000"/>
+            </w:tcBorders>
+          </w:tcPr>
+          <w:p>
+            <w:pPr>
+              <w:pStyle w:val="Normal"/>
+              <w:spacing w:before="0" w:after="160"/>
+              <w:rPr>
+                <w:lang w:val="en-GB"/>
+              </w:rPr>
+            </w:pPr>
+            <w:r>
+              <w:rPr>
+                <w:b/>
+                <w:color w:val="000000"/>
+                <w:sz w:val="22"/>
+                <w:u w:val="none"/>
+                <w:lang w:val="en-GB"/>
+              </w:rPr>
+              <w:t>{#health_expectantMother == 'YES'}</w:t>
+            </w:r>
+            <w:r>
+              <w:rPr>
+                <w:rFonts w:ascii="AppleSymbols" w:hAnsi="AppleSymbols"/>
+                <w:b/>
+                <w:color w:val="000000"/>
+                <w:sz w:val="22"/>
+                <w:u w:val="none"/>
+                <w:lang w:val="en-GB"/>
+              </w:rPr>
+              <w:t>✓</w:t>
+            </w:r>
+            <w:r>
+              <w:rPr>
+                <w:b/>
+                <w:color w:val="000000"/>
+                <w:sz w:val="22"/>
+                <w:u w:val="none"/>
+                <w:lang w:val="en-GB"/>
+              </w:rPr>
+              <w:t>{/}</w:t>
             </w:r>
           </w:p>
         </w:tc>
@@ -1764,52 +1653,59 @@
               <w:pStyle w:val="Normal"/>
               <w:spacing w:before="0" w:after="160"/>
               <w:rPr>
-                <w:b/>
-                <w:lang w:val="en-GB"/>
-              </w:rPr>
-            </w:pPr>
-            <w:r>
-              <w:fldChar w:fldCharType="begin">
-                <w:ffData>
-                  <w:name w:val="Check7 Copy 7"/>
-                  <w:enabled/>
-                  <w:calcOnExit w:val="0"/>
-                  <w:checkBox>
-                    <w:sizeAuto/>
-                  </w:checkBox>
-                </w:ffData>
-              </w:fldChar>
-            </w:r>
-            <w:r>
-              <w:rPr>
-                <w:b/>
-                <w:lang w:val="en-GB"/>
-              </w:rPr>
-              <w:instrText xml:space="preserve"> FORMCHECKBOX </w:instrText>
-            </w:r>
-            <w:r>
-              <w:rPr>
-                <w:b/>
-                <w:lang w:val="en-GB"/>
-              </w:rPr>
-              <w:fldChar w:fldCharType="separate"/>
-            </w:r>
-            <w:bookmarkStart w:id="24" w:name="Check7_Copy_7"/>
-            <w:bookmarkStart w:id="25" w:name="Check7_Copy_7"/>
-            <w:bookmarkEnd w:id="25"/>
-            <w:r/>
-            <w:r>
-              <w:rPr>
-                <w:b/>
-                <w:lang w:val="en-GB"/>
-              </w:rPr>
-              <w:fldChar w:fldCharType="end"/>
-            </w:r>
-            <w:r>
-              <w:rPr>
-                <w:b/>
-                <w:lang w:val="en-GB"/>
-              </w:rPr>
+                <w:lang w:val="en-GB"/>
+              </w:rPr>
+            </w:pPr>
+            <w:r>
+              <w:rPr>
+                <w:b/>
+                <w:color w:val="000000"/>
+                <w:sz w:val="22"/>
+                <w:u w:val="none"/>
+                <w:lang w:val="en-GB"/>
+              </w:rPr>
+              <w:t>{#health_expectantMother == '</w:t>
+            </w:r>
+            <w:r>
+              <w:rPr>
+                <w:b/>
+                <w:color w:val="000000"/>
+                <w:sz w:val="22"/>
+                <w:u w:val="none"/>
+                <w:lang w:val="en-GB"/>
+              </w:rPr>
+              <w:t>NO</w:t>
+            </w:r>
+            <w:r>
+              <w:rPr>
+                <w:b/>
+                <w:color w:val="000000"/>
+                <w:sz w:val="22"/>
+                <w:u w:val="none"/>
+                <w:lang w:val="en-GB"/>
+              </w:rPr>
+              <w:t>'}</w:t>
+            </w:r>
+            <w:r>
+              <w:rPr>
+                <w:rFonts w:ascii="AppleSymbols" w:hAnsi="AppleSymbols"/>
+                <w:b/>
+                <w:color w:val="000000"/>
+                <w:sz w:val="22"/>
+                <w:u w:val="none"/>
+                <w:lang w:val="en-GB"/>
+              </w:rPr>
+              <w:t>✓</w:t>
+            </w:r>
+            <w:r>
+              <w:rPr>
+                <w:b/>
+                <w:color w:val="000000"/>
+                <w:sz w:val="22"/>
+                <w:u w:val="none"/>
+                <w:lang w:val="en-GB"/>
+              </w:rPr>
+              <w:t>{/}</w:t>
             </w:r>
           </w:p>
         </w:tc>
@@ -1818,7 +1714,7 @@
         <w:trPr/>
         <w:tc>
           <w:tcPr>
-            <w:tcW w:w="8715" w:type="dxa"/>
+            <w:tcW w:w="8714" w:type="dxa"/>
             <w:tcBorders>
               <w:top w:val="single" w:sz="4" w:space="0" w:color="000000"/>
               <w:start w:val="single" w:sz="4" w:space="0" w:color="000000"/>
@@ -1844,65 +1740,52 @@
         </w:tc>
         <w:tc>
           <w:tcPr>
-            <w:tcW w:w="609" w:type="dxa"/>
-            <w:tcBorders>
-              <w:top w:val="single" w:sz="4" w:space="0" w:color="000000"/>
-              <w:start w:val="single" w:sz="4" w:space="0" w:color="000000"/>
-              <w:bottom w:val="single" w:sz="4" w:space="0" w:color="000000"/>
-              <w:end w:val="single" w:sz="4" w:space="0" w:color="000000"/>
-            </w:tcBorders>
-          </w:tcPr>
-          <w:p>
-            <w:pPr>
-              <w:pStyle w:val="Normal"/>
-              <w:spacing w:before="0" w:after="160"/>
-              <w:rPr>
-                <w:b/>
-                <w:lang w:val="en-GB"/>
-              </w:rPr>
-            </w:pPr>
-            <w:r>
-              <w:fldChar w:fldCharType="begin">
-                <w:ffData>
-                  <w:name w:val="Check7 Copy 8"/>
-                  <w:enabled/>
-                  <w:calcOnExit w:val="0"/>
-                  <w:checkBox>
-                    <w:sizeAuto/>
-                  </w:checkBox>
-                </w:ffData>
-              </w:fldChar>
-            </w:r>
-            <w:r>
-              <w:rPr>
-                <w:b/>
-                <w:lang w:val="en-GB"/>
-              </w:rPr>
-              <w:instrText xml:space="preserve"> FORMCHECKBOX </w:instrText>
-            </w:r>
-            <w:r>
-              <w:rPr>
-                <w:b/>
-                <w:lang w:val="en-GB"/>
-              </w:rPr>
-              <w:fldChar w:fldCharType="separate"/>
-            </w:r>
-            <w:bookmarkStart w:id="26" w:name="Check7_Copy_8"/>
-            <w:bookmarkStart w:id="27" w:name="Check7_Copy_8"/>
-            <w:bookmarkEnd w:id="27"/>
-            <w:r/>
-            <w:r>
-              <w:rPr>
-                <w:b/>
-                <w:lang w:val="en-GB"/>
-              </w:rPr>
-              <w:fldChar w:fldCharType="end"/>
-            </w:r>
-            <w:r>
-              <w:rPr>
-                <w:b/>
-                <w:lang w:val="en-GB"/>
-              </w:rPr>
+            <w:tcW w:w="610" w:type="dxa"/>
+            <w:tcBorders>
+              <w:top w:val="single" w:sz="4" w:space="0" w:color="000000"/>
+              <w:start w:val="single" w:sz="4" w:space="0" w:color="000000"/>
+              <w:bottom w:val="single" w:sz="4" w:space="0" w:color="000000"/>
+              <w:end w:val="single" w:sz="4" w:space="0" w:color="000000"/>
+            </w:tcBorders>
+          </w:tcPr>
+          <w:p>
+            <w:pPr>
+              <w:pStyle w:val="Normal"/>
+              <w:spacing w:before="0" w:after="160"/>
+              <w:rPr>
+                <w:lang w:val="en-GB"/>
+              </w:rPr>
+            </w:pPr>
+            <w:r>
+              <w:rPr>
+                <w:b/>
+                <w:color w:val="000000"/>
+                <w:sz w:val="22"/>
+                <w:u w:val="none"/>
+                <w:lang w:val="en-GB"/>
+              </w:rPr>
+              <w:t>{#health_nightWorkIllHealth == 'YES'}</w:t>
+            </w:r>
+            <w:r>
+              <w:rPr>
+                <w:rFonts w:ascii="AppleSymbols" w:hAnsi="AppleSymbols"/>
+                <w:b/>
+                <w:color w:val="000000"/>
+                <w:sz w:val="22"/>
+                <w:u w:val="none"/>
+                <w:lang w:val="en-GB"/>
+              </w:rPr>
+              <w:t>✓</w:t>
+            </w:r>
+            <w:r>
+              <w:rPr>
+                <w:b/>
+                <w:color w:val="000000"/>
+                <w:sz w:val="22"/>
+                <w:u w:val="none"/>
+                <w:lang w:val="en-GB"/>
+              </w:rPr>
+              <w:t>{/}</w:t>
             </w:r>
           </w:p>
         </w:tc>
@@ -1921,56 +1804,59 @@
               <w:pStyle w:val="Normal"/>
               <w:spacing w:before="0" w:after="160"/>
               <w:rPr>
-                <w:b/>
-                <w:lang w:val="en-GB"/>
-              </w:rPr>
-            </w:pPr>
-            <w:r>
-              <w:rPr/>
-              <w:drawing>
-                <wp:inline distT="0" distB="0" distL="0" distR="0">
-                  <wp:extent cx="123825" cy="208915"/>
-                  <wp:effectExtent l="0" t="0" r="0" b="0"/>
-                  <wp:docPr id="10" name="Image10" descr="Checkmark with solid fill"/>
-                  <wp:cNvGraphicFramePr>
-                    <a:graphicFrameLocks xmlns:a="http://schemas.openxmlformats.org/drawingml/2006/main" noChangeAspect="1"/>
-                  </wp:cNvGraphicFramePr>
-                  <a:graphic xmlns:a="http://schemas.openxmlformats.org/drawingml/2006/main">
-                    <a:graphicData uri="http://schemas.openxmlformats.org/drawingml/2006/picture">
-                      <pic:pic xmlns:pic="http://schemas.openxmlformats.org/drawingml/2006/picture">
-                        <pic:nvPicPr>
-                          <pic:cNvPr id="10" name="Image10" descr="Checkmark with solid fill"/>
-                          <pic:cNvPicPr>
-                            <a:picLocks noChangeAspect="1" noChangeArrowheads="1"/>
-                          </pic:cNvPicPr>
-                        </pic:nvPicPr>
-                        <pic:blipFill>
-                          <a:blip r:embed="rId20">
-                            <a:extLst>
-                              <a:ext uri="{96DAC541-7B7A-43D3-8B79-37D633B846F1}">
-                                <asvg:svgBlip xmlns:asvg="http://schemas.microsoft.com/office/drawing/2016/SVG/main" r:embed="rId21"/>
-                              </a:ext>
-                            </a:extLst>
-                          </a:blip>
-                          <a:stretch>
-                            <a:fillRect/>
-                          </a:stretch>
-                        </pic:blipFill>
-                        <pic:spPr bwMode="auto">
-                          <a:xfrm>
-                            <a:off x="0" y="0"/>
-                            <a:ext cx="123825" cy="208915"/>
-                          </a:xfrm>
-                          <a:prstGeom prst="rect">
-                            <a:avLst/>
-                          </a:prstGeom>
-                          <a:noFill/>
-                        </pic:spPr>
-                      </pic:pic>
-                    </a:graphicData>
-                  </a:graphic>
-                </wp:inline>
-              </w:drawing>
+                <w:lang w:val="en-GB"/>
+              </w:rPr>
+            </w:pPr>
+            <w:r>
+              <w:rPr>
+                <w:b/>
+                <w:color w:val="000000"/>
+                <w:sz w:val="22"/>
+                <w:u w:val="none"/>
+                <w:lang w:val="en-GB"/>
+              </w:rPr>
+              <w:t>{#health_nightWorkIllHealth == '</w:t>
+            </w:r>
+            <w:r>
+              <w:rPr>
+                <w:b/>
+                <w:color w:val="000000"/>
+                <w:sz w:val="22"/>
+                <w:u w:val="none"/>
+                <w:lang w:val="en-GB"/>
+              </w:rPr>
+              <w:t>NO</w:t>
+            </w:r>
+            <w:r>
+              <w:rPr>
+                <w:b/>
+                <w:color w:val="000000"/>
+                <w:sz w:val="22"/>
+                <w:u w:val="none"/>
+                <w:lang w:val="en-GB"/>
+              </w:rPr>
+              <w:t>'}</w:t>
+            </w:r>
+            <w:r>
+              <w:rPr>
+                <w:rFonts w:ascii="AppleSymbols" w:hAnsi="AppleSymbols"/>
+                <w:b/>
+                <w:color w:val="000000"/>
+                <w:sz w:val="22"/>
+                <w:u w:val="none"/>
+                <w:lang w:val="en-GB"/>
+              </w:rPr>
+              <w:t>✓</w:t>
+            </w:r>
+            <w:r>
+              <w:rPr>
+                <w:b/>
+                <w:color w:val="000000"/>
+                <w:sz w:val="22"/>
+                <w:u w:val="none"/>
+                <w:lang w:val="en-GB"/>
+              </w:rPr>
+              <w:t>{/}</w:t>
             </w:r>
           </w:p>
         </w:tc>
@@ -2007,7 +1893,7 @@
       <w:tblPr>
         <w:tblW w:w="9828" w:type="dxa"/>
         <w:jc w:val="start"/>
-        <w:tblInd w:w="-270" w:type="dxa"/>
+        <w:tblInd w:w="-162" w:type="dxa"/>
         <w:tblLayout w:type="fixed"/>
         <w:tblCellMar>
           <w:top w:w="0" w:type="dxa"/>
@@ -2042,6 +1928,7 @@
               <w:rPr>
                 <w:lang w:val="en-GB"/>
               </w:rPr>
+              <w:t>{health_conditionDetails}</w:t>
             </w:r>
           </w:p>
         </w:tc>
@@ -2104,7 +1991,7 @@
       <w:tblPr>
         <w:tblW w:w="9828" w:type="dxa"/>
         <w:jc w:val="start"/>
-        <w:tblInd w:w="-256" w:type="dxa"/>
+        <w:tblInd w:w="-148" w:type="dxa"/>
         <w:tblLayout w:type="fixed"/>
         <w:tblCellMar>
           <w:top w:w="0" w:type="dxa"/>
@@ -2229,7 +2116,7 @@
       <w:tblPr>
         <w:tblW w:w="9854" w:type="dxa"/>
         <w:jc w:val="start"/>
-        <w:tblInd w:w="-242" w:type="dxa"/>
+        <w:tblInd w:w="-134" w:type="dxa"/>
         <w:tblLayout w:type="fixed"/>
         <w:tblCellMar>
           <w:top w:w="0" w:type="dxa"/>
@@ -2241,8 +2128,8 @@
       </w:tblPr>
       <w:tblGrid>
         <w:gridCol w:w="1008"/>
-        <w:gridCol w:w="5686"/>
-        <w:gridCol w:w="696"/>
+        <w:gridCol w:w="5685"/>
+        <w:gridCol w:w="697"/>
         <w:gridCol w:w="2464"/>
       </w:tblGrid>
       <w:tr>
@@ -2268,9 +2155,9 @@
             </w:r>
           </w:p>
         </w:tc>
-        <w:tc xml:space="preserve">
-          <w:tcPr>
-            <w:tcW w:w="5686" w:type="dxa"/>
+        <w:tc>
+          <w:tcPr>
+            <w:tcW w:w="5685" w:type="dxa"/>
             <w:tcBorders>
               <w:bottom w:val="dotted" w:sz="4" w:space="0" w:color="000000"/>
             </w:tcBorders>
@@ -2284,22 +2171,14 @@
               </w:rPr>
             </w:pPr>
             <w:r>
-              <w:rPr>
-                <w:lang w:val="en-GB"/>
-              </w:rPr>
-              <w:t/>
-            </w:r>
-            <w:r>
+              <w:rPr/>
               <w:t>{%signature}</w:t>
             </w:r>
-            <w:r>
-              <w:t xml:space="preserve"/>
-            </w:r>
-          </w:p>
-        </w:tc>
-        <w:tc>
-          <w:tcPr>
-            <w:tcW w:w="696" w:type="dxa"/>
+          </w:p>
+        </w:tc>
+        <w:tc>
+          <w:tcPr>
+            <w:tcW w:w="697" w:type="dxa"/>
             <w:tcBorders/>
           </w:tcPr>
           <w:p>
@@ -2354,9 +2233,9 @@
       </w:r>
     </w:p>
     <w:sectPr>
-      <w:headerReference w:type="even" r:id="rId22"/>
-      <w:headerReference w:type="default" r:id="rId23"/>
-      <w:headerReference w:type="first" r:id="rId24"/>
+      <w:headerReference w:type="even" r:id="rId2"/>
+      <w:headerReference w:type="default" r:id="rId3"/>
+      <w:headerReference w:type="first" r:id="rId4"/>
       <w:type w:val="nextPage"/>
       <w:pgSz w:w="11906" w:h="16838"/>
       <w:pgMar w:left="1134" w:right="1021" w:gutter="0" w:header="709" w:top="3402" w:footer="0" w:bottom="3119"/>
@@ -2393,7 +2272,7 @@
     <w:r>
       <w:rPr/>
       <w:drawing>
-        <wp:anchor distT="0" distB="0" distL="0" distR="0" simplePos="0" relativeHeight="13" behindDoc="1" locked="0" layoutInCell="0" allowOverlap="1">
+        <wp:anchor distT="0" distB="0" distL="0" distR="0" simplePos="0" relativeHeight="7" behindDoc="1" locked="0" layoutInCell="0" allowOverlap="1">
           <wp:simplePos x="0" y="0"/>
           <wp:positionH relativeFrom="page">
             <wp:posOffset>12700</wp:posOffset>
@@ -2404,7 +2283,7 @@
           <wp:extent cx="7550150" cy="10665460"/>
           <wp:effectExtent l="0" t="0" r="0" b="0"/>
           <wp:wrapNone/>
-          <wp:docPr id="11" name="Picture 1"/>
+          <wp:docPr id="1" name="Picture 1"/>
           <wp:cNvGraphicFramePr>
             <a:graphicFrameLocks xmlns:a="http://schemas.openxmlformats.org/drawingml/2006/main" noChangeAspect="1"/>
           </wp:cNvGraphicFramePr>
@@ -2412,7 +2291,7 @@
             <a:graphicData uri="http://schemas.openxmlformats.org/drawingml/2006/picture">
               <pic:pic xmlns:pic="http://schemas.openxmlformats.org/drawingml/2006/picture">
                 <pic:nvPicPr>
-                  <pic:cNvPr id="11" name="Picture 1"/>
+                  <pic:cNvPr id="1" name="Picture 1"/>
                   <pic:cNvPicPr>
                     <a:picLocks noChangeAspect="1" noChangeArrowheads="1"/>
                   </pic:cNvPicPr>
@@ -2453,7 +2332,7 @@
     <w:r>
       <w:rPr/>
       <w:drawing>
-        <wp:anchor distT="0" distB="0" distL="0" distR="0" simplePos="0" relativeHeight="13" behindDoc="1" locked="0" layoutInCell="0" allowOverlap="1">
+        <wp:anchor distT="0" distB="0" distL="0" distR="0" simplePos="0" relativeHeight="7" behindDoc="1" locked="0" layoutInCell="0" allowOverlap="1">
           <wp:simplePos x="0" y="0"/>
           <wp:positionH relativeFrom="page">
             <wp:posOffset>12700</wp:posOffset>
@@ -2464,7 +2343,7 @@
           <wp:extent cx="7550150" cy="10665460"/>
           <wp:effectExtent l="0" t="0" r="0" b="0"/>
           <wp:wrapNone/>
-          <wp:docPr id="12" name="Picture 1"/>
+          <wp:docPr id="2" name="Picture 1"/>
           <wp:cNvGraphicFramePr>
             <a:graphicFrameLocks xmlns:a="http://schemas.openxmlformats.org/drawingml/2006/main" noChangeAspect="1"/>
           </wp:cNvGraphicFramePr>
@@ -2472,7 +2351,7 @@
             <a:graphicData uri="http://schemas.openxmlformats.org/drawingml/2006/picture">
               <pic:pic xmlns:pic="http://schemas.openxmlformats.org/drawingml/2006/picture">
                 <pic:nvPicPr>
-                  <pic:cNvPr id="12" name="Picture 1"/>
+                  <pic:cNvPr id="2" name="Picture 1"/>
                   <pic:cNvPicPr>
                     <a:picLocks noChangeAspect="1" noChangeArrowheads="1"/>
                   </pic:cNvPicPr>
@@ -2508,7 +2387,7 @@
   <w:docDefaults>
     <w:rPrDefault>
       <w:rPr>
-        <w:rFonts w:ascii="Calibri" w:hAnsi="Calibri" w:eastAsia="Calibri" w:cs="Mangal" w:asciiTheme="minorHAnsi" w:cstheme="minorBidi" w:eastAsiaTheme="minorHAnsi" w:hAnsiTheme="minorHAnsi"/>
+        <w:rFonts w:ascii="Calibri" w:hAnsi="Calibri" w:eastAsia="Calibri" w:cs="" w:asciiTheme="minorHAnsi" w:cstheme="minorBidi" w:eastAsiaTheme="minorHAnsi" w:hAnsiTheme="minorHAnsi"/>
         <w:kern w:val="2"/>
         <w:sz w:val="22"/>
         <w:lang w:val="en-IN" w:eastAsia="en-US" w:bidi="hi-IN"/>
@@ -2904,12 +2783,13 @@
     <w:qFormat/>
     <w:pPr>
       <w:widowControl/>
+      <w:suppressAutoHyphens w:val="true"/>
       <w:bidi w:val="0"/>
       <w:spacing w:lineRule="auto" w:line="259" w:before="0" w:after="160"/>
       <w:jc w:val="start"/>
     </w:pPr>
     <w:rPr>
-      <w:rFonts w:ascii="Calibri" w:hAnsi="Calibri" w:eastAsia="Calibri" w:cs="Mangal" w:asciiTheme="minorHAnsi" w:cstheme="minorBidi" w:eastAsiaTheme="minorHAnsi" w:hAnsiTheme="minorHAnsi"/>
+      <w:rFonts w:ascii="Calibri" w:hAnsi="Calibri" w:eastAsia="Calibri" w:cs="" w:asciiTheme="minorHAnsi" w:cstheme="minorBidi" w:eastAsiaTheme="minorHAnsi" w:hAnsiTheme="minorHAnsi"/>
       <w:color w:val="auto"/>
       <w:kern w:val="2"/>
       <w:sz w:val="22"/>

</xml_diff>